<commit_message>
Integrate day 2 evidence into the individual training takeaways synthesis
Consolidate the day 1 continuum points into a dedicated continuum section,
add the training continuum and its calibration as display bands, and refine
the working proposition around a common standard reached by different routes.
</commit_message>
<xml_diff>
--- a/output/individual-training-key-takeaways.docx
+++ b/output/individual-training-key-takeaways.docx
@@ -5,14 +5,14 @@
     <w:p>
       <w:pPr>
         <w:pStyle w:val="Normal"/>
-        <w:spacing w:before="0" w:after="200"/>
+        <w:spacing w:before="0" w:after="160"/>
         <w:rPr/>
       </w:pPr>
       <w:r>
         <w:rPr/>
         <w:drawing>
           <wp:inline distT="0" distB="0" distL="0" distR="0">
-            <wp:extent cx="1367790" cy="312420"/>
+            <wp:extent cx="1259840" cy="287655"/>
             <wp:effectExtent l="0" t="0" r="0" b="0"/>
             <wp:docPr id="1" name="Picture 1" descr=""/>
             <wp:cNvGraphicFramePr>
@@ -36,7 +36,7 @@
                   <pic:spPr bwMode="auto">
                     <a:xfrm>
                       <a:off x="0" y="0"/>
-                      <a:ext cx="1367790" cy="312420"/>
+                      <a:ext cx="1259840" cy="287655"/>
                     </a:xfrm>
                     <a:prstGeom prst="rect">
                       <a:avLst/>
@@ -60,7 +60,7 @@
           <w:rFonts w:cs="Arial Black" w:ascii="Arial Black" w:hAnsi="Arial Black"/>
           <w:b w:val="false"/>
           <w:color w:val="000000"/>
-          <w:sz w:val="34"/>
+          <w:sz w:val="32"/>
         </w:rPr>
         <w:t>Individual Training – Key Takeaways</w:t>
       </w:r>
@@ -79,9 +79,9 @@
           <w:rFonts w:cs="Calibri"/>
           <w:b/>
           <w:color w:val="00261B"/>
-          <w:sz w:val="23"/>
-        </w:rPr>
-        <w:t>Adult Learning Principles in Defence Training — Day 1</w:t>
+          <w:sz w:val="22"/>
+        </w:rPr>
+        <w:t>Adult Learning Principles in Defence Training — Days 1–2</w:t>
       </w:r>
     </w:p>
     <w:p>
@@ -131,7 +131,7 @@
           <w:color w:val="000000"/>
           <w:sz w:val="18"/>
         </w:rPr>
-        <w:t>1 September 2026</w:t>
+        <w:t>September 2026</w:t>
       </w:r>
       <w:r>
         <w:rPr>
@@ -154,7 +154,7 @@
           <w:color w:val="000000"/>
           <w:sz w:val="18"/>
         </w:rPr>
-        <w:t>Working draft v0.1</w:t>
+        <w:t>Working draft v0.2</w:t>
       </w:r>
     </w:p>
     <w:p>
@@ -193,7 +193,7 @@
           <w:b/>
           <w:i w:val="false"/>
           <w:color w:val="00261B"/>
-          <w:sz w:val="21"/>
+          <w:sz w:val="19"/>
         </w:rPr>
         <w:t>What is the Army approach to individual training?</w:t>
       </w:r>
@@ -209,7 +209,7 @@
           <w:b w:val="false"/>
           <w:i w:val="false"/>
         </w:rPr>
-        <w:t>The takeaways below are drawn from today's discussion as evidence toward answering this question. They are working conclusions to be tested and refined over the remaining sessions.</w:t>
+        <w:t>A working synthesis of the evidence so far, not a record of the sessions — to be tested and refined as the activity continues.</w:t>
       </w:r>
     </w:p>
     <w:p>
@@ -238,7 +238,7 @@
           <w:tab w:val="clear" w:pos="720"/>
           <w:tab w:val="left" w:pos="425" w:leader="none"/>
         </w:tabs>
-        <w:spacing w:before="0" w:after="100"/>
+        <w:spacing w:before="0" w:after="80"/>
         <w:ind w:hanging="425" w:left="425"/>
         <w:rPr/>
       </w:pPr>
@@ -246,7 +246,7 @@
         <w:rPr>
           <w:rFonts w:cs="Arial Black" w:ascii="Arial Black" w:hAnsi="Arial Black"/>
           <w:color w:val="D31145"/>
-          <w:sz w:val="20"/>
+          <w:sz w:val="18"/>
         </w:rPr>
         <w:t>1</w:t>
         <w:tab/>
@@ -265,7 +265,7 @@
           <w:b w:val="false"/>
           <w:i w:val="false"/>
         </w:rPr>
-        <w:t xml:space="preserve"> Course completion and education are means, not ends. The measure of success is whether the individual can perform to standard in their role and on operations.</w:t>
+        <w:t xml:space="preserve"> Course completion and education are means, not ends. Success is whether the individual can perform to standard in their role and on operations.</w:t>
       </w:r>
     </w:p>
     <w:p>
@@ -275,7 +275,7 @@
           <w:tab w:val="clear" w:pos="720"/>
           <w:tab w:val="left" w:pos="425" w:leader="none"/>
         </w:tabs>
-        <w:spacing w:before="0" w:after="100"/>
+        <w:spacing w:before="0" w:after="80"/>
         <w:ind w:hanging="425" w:left="425"/>
         <w:rPr/>
       </w:pPr>
@@ -283,7 +283,7 @@
         <w:rPr>
           <w:rFonts w:cs="Arial Black" w:ascii="Arial Black" w:hAnsi="Arial Black"/>
           <w:color w:val="D31145"/>
-          <w:sz w:val="20"/>
+          <w:sz w:val="18"/>
         </w:rPr>
         <w:t>2</w:t>
         <w:tab/>
@@ -294,15 +294,15 @@
           <w:b/>
           <w:i w:val="false"/>
         </w:rPr>
-        <w:t>Army learning sits on a continuum from directive to self-directed.</w:t>
-      </w:r>
-      <w:r>
-        <w:rPr>
-          <w:rFonts w:cs="Calibri"/>
-          <w:b w:val="false"/>
-          <w:i w:val="false"/>
-        </w:rPr>
-        <w:t xml:space="preserve"> At one end, instruction is prescribed and tightly controlled; at the other, learning is driven by the individual through reflection and experience. Neither end is inherently better — the continuum itself is the tool.</w:t>
+        <w:t>A common standard does not require an identical learning journey.</w:t>
+      </w:r>
+      <w:r>
+        <w:rPr>
+          <w:rFonts w:cs="Calibri"/>
+          <w:b w:val="false"/>
+          <w:i w:val="false"/>
+        </w:rPr>
+        <w:t xml:space="preserve"> People arrive shaped by genetics, prior experience, education, environment and stress, and neurodiversity adds further variation. Army can hold the performance standard firm while varying the route people take to reach it.</w:t>
       </w:r>
     </w:p>
     <w:p>
@@ -312,7 +312,7 @@
           <w:tab w:val="clear" w:pos="720"/>
           <w:tab w:val="left" w:pos="425" w:leader="none"/>
         </w:tabs>
-        <w:spacing w:before="0" w:after="100"/>
+        <w:spacing w:before="0" w:after="80"/>
         <w:ind w:hanging="425" w:left="425"/>
         <w:rPr/>
       </w:pPr>
@@ -320,7 +320,7 @@
         <w:rPr>
           <w:rFonts w:cs="Arial Black" w:ascii="Arial Black" w:hAnsi="Arial Black"/>
           <w:color w:val="D31145"/>
-          <w:sz w:val="20"/>
+          <w:sz w:val="18"/>
         </w:rPr>
         <w:t>3</w:t>
         <w:tab/>
@@ -331,15 +331,15 @@
           <w:b/>
           <w:i w:val="false"/>
         </w:rPr>
-        <w:t>The right point on that continuum is set by risk, complexity, learner experience and the required operational outcome.</w:t>
-      </w:r>
-      <w:r>
-        <w:rPr>
-          <w:rFonts w:cs="Calibri"/>
-          <w:b w:val="false"/>
-          <w:i w:val="false"/>
-        </w:rPr>
-        <w:t xml:space="preserve"> There is no single Army method; there is a deliberate choice of approach against these factors.</w:t>
+        <w:t>Capability is built, not simply selected for.</w:t>
+      </w:r>
+      <w:r>
+        <w:rPr>
+          <w:rFonts w:cs="Calibri"/>
+          <w:b w:val="false"/>
+          <w:i w:val="false"/>
+        </w:rPr>
+        <w:t xml:space="preserve"> The brain stays adaptable, so practice, repetition, feedback and experience keep developing performance well beyond initial training. Where operational risk permits, learners need room to fail safely and try again before facing consequential conditions.</w:t>
       </w:r>
     </w:p>
     <w:p>
@@ -349,7 +349,7 @@
           <w:tab w:val="clear" w:pos="720"/>
           <w:tab w:val="left" w:pos="425" w:leader="none"/>
         </w:tabs>
-        <w:spacing w:before="0" w:after="100"/>
+        <w:spacing w:before="0" w:after="80"/>
         <w:ind w:hanging="425" w:left="425"/>
         <w:rPr/>
       </w:pPr>
@@ -357,7 +357,7 @@
         <w:rPr>
           <w:rFonts w:cs="Arial Black" w:ascii="Arial Black" w:hAnsi="Arial Black"/>
           <w:color w:val="D31145"/>
-          <w:sz w:val="20"/>
+          <w:sz w:val="18"/>
         </w:rPr>
         <w:t>4</w:t>
         <w:tab/>
@@ -368,15 +368,15 @@
           <w:b/>
           <w:i w:val="false"/>
         </w:rPr>
-        <w:t>High-risk and foundational training demands standardisation and direction.</w:t>
-      </w:r>
-      <w:r>
-        <w:rPr>
-          <w:rFonts w:cs="Calibri"/>
-          <w:b w:val="false"/>
-          <w:i w:val="false"/>
-        </w:rPr>
-        <w:t xml:space="preserve"> Experienced learners, leadership development and professional development can carry greater autonomy, reflection and judgement. Getting this calibration wrong in either direction wastes training effort or accepts unnecessary risk.</w:t>
+        <w:t>Sequence training to the limits of working memory.</w:t>
+      </w:r>
+      <w:r>
+        <w:rPr>
+          <w:rFonts w:cs="Calibri"/>
+          <w:b w:val="false"/>
+          <w:i w:val="false"/>
+        </w:rPr>
+        <w:t xml:space="preserve"> Establish foundations, chunk complexity, then use retrieval and spaced practice to drive skills toward automaticity. Automaticity is what frees capacity for judgement under pressure.</w:t>
       </w:r>
     </w:p>
     <w:p>
@@ -386,7 +386,7 @@
           <w:tab w:val="clear" w:pos="720"/>
           <w:tab w:val="left" w:pos="425" w:leader="none"/>
         </w:tabs>
-        <w:spacing w:before="0" w:after="100"/>
+        <w:spacing w:before="0" w:after="80"/>
         <w:ind w:hanging="425" w:left="425"/>
         <w:rPr/>
       </w:pPr>
@@ -394,7 +394,7 @@
         <w:rPr>
           <w:rFonts w:cs="Arial Black" w:ascii="Arial Black" w:hAnsi="Arial Black"/>
           <w:color w:val="D31145"/>
-          <w:sz w:val="20"/>
+          <w:sz w:val="18"/>
         </w:rPr>
         <w:t>5</w:t>
         <w:tab/>
@@ -405,15 +405,15 @@
           <w:b/>
           <w:i w:val="false"/>
         </w:rPr>
-        <w:t>Individual training is wider than formal courses.</w:t>
-      </w:r>
-      <w:r>
-        <w:rPr>
-          <w:rFonts w:cs="Calibri"/>
-          <w:b w:val="false"/>
-          <w:i w:val="false"/>
-        </w:rPr>
-        <w:t xml:space="preserve"> Workplace experience, coaching, practice, feedback and reflection are part of the system, not adjuncts to it. Any answer to the Commander's question must account for learning that happens in units, not just in schools.</w:t>
+        <w:t>Stress is a training variable to be managed, not removed.</w:t>
+      </w:r>
+      <w:r>
+        <w:rPr>
+          <w:rFonts w:cs="Calibri"/>
+          <w:b w:val="false"/>
+          <w:i w:val="false"/>
+        </w:rPr>
+        <w:t xml:space="preserve"> Too little challenge disengages; too much blocks learning. Complexity and pressure should increase deliberately as competence grows, so the learner finishes able to perform under operational conditions.</w:t>
       </w:r>
     </w:p>
     <w:p>
@@ -423,7 +423,7 @@
           <w:tab w:val="clear" w:pos="720"/>
           <w:tab w:val="left" w:pos="425" w:leader="none"/>
         </w:tabs>
-        <w:spacing w:before="0" w:after="100"/>
+        <w:spacing w:before="0" w:after="80"/>
         <w:ind w:hanging="425" w:left="425"/>
         <w:rPr/>
       </w:pPr>
@@ -431,7 +431,7 @@
         <w:rPr>
           <w:rFonts w:cs="Arial Black" w:ascii="Arial Black" w:hAnsi="Arial Black"/>
           <w:color w:val="D31145"/>
-          <w:sz w:val="20"/>
+          <w:sz w:val="18"/>
         </w:rPr>
         <w:t>6</w:t>
         <w:tab/>
@@ -442,15 +442,15 @@
           <w:b/>
           <w:i w:val="false"/>
         </w:rPr>
-        <w:t>Learners commit when they understand why the training matters.</w:t>
-      </w:r>
-      <w:r>
-        <w:rPr>
-          <w:rFonts w:cs="Calibri"/>
-          <w:b w:val="false"/>
-          <w:i w:val="false"/>
-        </w:rPr>
-        <w:t xml:space="preserve"> Motivation and engagement improve markedly when people can connect the learning to their role and to operational outcomes. Purpose is a training design input, not an afterthought.</w:t>
+        <w:t>Learner state governs how much learning is possible.</w:t>
+      </w:r>
+      <w:r>
+        <w:rPr>
+          <w:rFonts w:cs="Calibri"/>
+          <w:b w:val="false"/>
+          <w:i w:val="false"/>
+        </w:rPr>
+        <w:t xml:space="preserve"> Sleep, fatigue, nutrition, emotional state, distraction and psychological safety materially affect capacity to learn. So does purpose — people commit when they can see why the training matters to their role.</w:t>
       </w:r>
     </w:p>
     <w:p>
@@ -460,7 +460,7 @@
           <w:tab w:val="clear" w:pos="720"/>
           <w:tab w:val="left" w:pos="425" w:leader="none"/>
         </w:tabs>
-        <w:spacing w:before="0" w:after="100"/>
+        <w:spacing w:before="0" w:after="80"/>
         <w:ind w:hanging="425" w:left="425"/>
         <w:rPr/>
       </w:pPr>
@@ -468,7 +468,7 @@
         <w:rPr>
           <w:rFonts w:cs="Arial Black" w:ascii="Arial Black" w:hAnsi="Arial Black"/>
           <w:color w:val="D31145"/>
-          <w:sz w:val="20"/>
+          <w:sz w:val="18"/>
         </w:rPr>
         <w:t>7</w:t>
         <w:tab/>
@@ -479,15 +479,139 @@
           <w:b/>
           <w:i w:val="false"/>
         </w:rPr>
-        <w:t>Frameworks are enablers, not the approach.</w:t>
-      </w:r>
-      <w:r>
-        <w:rPr>
-          <w:rFonts w:cs="Calibri"/>
-          <w:b w:val="false"/>
-          <w:i w:val="false"/>
-        </w:rPr>
-        <w:t xml:space="preserve"> ADDIE, SAM, 70:20:10, Bloom's Taxonomy and andragogy are tools Army can apply; none of them is the Army approach to individual training. The likely binding constraint is training governance and the speed at which Army can adapt training — not the absence of suitable frameworks.</w:t>
+        <w:t>The instructor is the adaptive element in the system.</w:t>
+      </w:r>
+      <w:r>
+        <w:rPr>
+          <w:rFonts w:cs="Calibri"/>
+          <w:b w:val="false"/>
+          <w:i w:val="false"/>
+        </w:rPr>
+        <w:t xml:space="preserve"> Instructors must read learner state, check understanding, give feedback, adjust pacing and know when specialist support is needed. Multiple modes of instruction, assistive technology and reasonable adjustment improve access without lowering the standard.</w:t>
+      </w:r>
+    </w:p>
+    <w:p>
+      <w:pPr>
+        <w:pStyle w:val="Normal"/>
+        <w:tabs>
+          <w:tab w:val="clear" w:pos="720"/>
+          <w:tab w:val="left" w:pos="425" w:leader="none"/>
+        </w:tabs>
+        <w:spacing w:before="0" w:after="80"/>
+        <w:ind w:hanging="425" w:left="425"/>
+        <w:rPr/>
+      </w:pPr>
+      <w:r>
+        <w:rPr>
+          <w:rFonts w:cs="Arial Black" w:ascii="Arial Black" w:hAnsi="Arial Black"/>
+          <w:color w:val="D31145"/>
+          <w:sz w:val="18"/>
+        </w:rPr>
+        <w:t>8</w:t>
+        <w:tab/>
+      </w:r>
+      <w:r>
+        <w:rPr>
+          <w:rFonts w:cs="Calibri"/>
+          <w:b/>
+          <w:i w:val="false"/>
+        </w:rPr>
+        <w:t>The science is evidence, not the approach.</w:t>
+      </w:r>
+      <w:r>
+        <w:rPr>
+          <w:rFonts w:cs="Calibri"/>
+          <w:b w:val="false"/>
+          <w:i w:val="false"/>
+        </w:rPr>
+        <w:t xml:space="preserve"> Neuroplasticity, cognitive load, neurodiversity and Universal Design for Learning — like ADDIE, SAM, 70:20:10 and Bloom's — inform how Army designs and delivers training; none is the approach itself. The binding constraint remains training governance and the speed at which Army can adapt training.</w:t>
+      </w:r>
+    </w:p>
+    <w:p>
+      <w:pPr>
+        <w:pStyle w:val="Heading1"/>
+        <w:pBdr>
+          <w:top w:val="single" w:sz="12" w:space="6" w:color="000000"/>
+        </w:pBdr>
+        <w:rPr/>
+      </w:pPr>
+      <w:r>
+        <w:rPr>
+          <w:rFonts w:cs="Arial Black" w:ascii="Arial Black" w:hAnsi="Arial Black"/>
+          <w:b w:val="false"/>
+          <w:i w:val="false"/>
+          <w:color w:val="000000"/>
+          <w:sz w:val="24"/>
+        </w:rPr>
+        <w:t>The Emerging Continuum</w:t>
+      </w:r>
+    </w:p>
+    <w:p>
+      <w:pPr>
+        <w:pStyle w:val="Normal"/>
+        <w:shd w:val="clear" w:color="auto" w:fill="00261B"/>
+        <w:spacing w:before="100" w:after="120"/>
+        <w:ind w:left="57" w:right="57"/>
+        <w:jc w:val="center"/>
+        <w:rPr/>
+      </w:pPr>
+      <w:r>
+        <w:rPr>
+          <w:rFonts w:cs="Calibri"/>
+          <w:b/>
+          <w:i w:val="false"/>
+          <w:color w:val="FFFFFF"/>
+          <w:sz w:val="17"/>
+        </w:rPr>
+        <w:t>Foundation → Guided Practice → Independent Practice → Applied / Experiential Learning → Performance Under Pressure</w:t>
+      </w:r>
+    </w:p>
+    <w:p>
+      <w:pPr>
+        <w:pStyle w:val="Normal"/>
+        <w:rPr/>
+      </w:pPr>
+      <w:r>
+        <w:rPr>
+          <w:rFonts w:cs="Calibri"/>
+          <w:b w:val="false"/>
+          <w:i w:val="false"/>
+        </w:rPr>
+        <w:t>Instructor direction decreases across the continuum while learner autonomy, complexity and pressure increase. How far and how fast an individual moves is set by:</w:t>
+      </w:r>
+    </w:p>
+    <w:p>
+      <w:pPr>
+        <w:pStyle w:val="Normal"/>
+        <w:shd w:val="clear" w:color="auto" w:fill="00261B"/>
+        <w:spacing w:before="100" w:after="120"/>
+        <w:ind w:left="57" w:right="57"/>
+        <w:jc w:val="center"/>
+        <w:rPr/>
+      </w:pPr>
+      <w:r>
+        <w:rPr>
+          <w:rFonts w:cs="Calibri"/>
+          <w:b/>
+          <w:i w:val="false"/>
+          <w:color w:val="FFFFFF"/>
+          <w:sz w:val="17"/>
+        </w:rPr>
+        <w:t>Risk × Complexity × Learner Experience &amp; Competence × Required Operational Outcome</w:t>
+      </w:r>
+    </w:p>
+    <w:p>
+      <w:pPr>
+        <w:pStyle w:val="Normal"/>
+        <w:rPr/>
+      </w:pPr>
+      <w:r>
+        <w:rPr>
+          <w:rFonts w:cs="Calibri"/>
+          <w:b w:val="false"/>
+          <w:i w:val="false"/>
+        </w:rPr>
+        <w:t>High-risk and foundational training sits at the left: standardised, directive, tightly controlled. Experienced learners, leadership and professional development sit further right, with greater autonomy, reflection and judgement. Much of the right-hand end happens in units, not schools — workplace experience, coaching, practice and reflection — and is part of the training system, not an adjunct to it.</w:t>
       </w:r>
     </w:p>
     <w:p>
@@ -526,9 +650,9 @@
           <w:b/>
           <w:i w:val="false"/>
           <w:color w:val="00261B"/>
-          <w:sz w:val="21"/>
-        </w:rPr>
-        <w:t>Army develops individuals progressively toward operational competence, applying the level of direction, experiential learning and learner autonomy appropriate to the risk and complexity of the training, the experience of the learner, and the required operational outcome.</w:t>
+          <w:sz w:val="19"/>
+        </w:rPr>
+        <w:t>Army develops individuals progressively toward a common operational standard — from foundation, through guided and independent practice, to applied learning and performance under pressure — adapting the direction, support, complexity and pressure applied to the risk, complexity, learner competence and required operational outcome. The standard is common; the journey to it need not be identical.</w:t>
       </w:r>
     </w:p>
     <w:p>
@@ -536,7 +660,7 @@
         <w:pStyle w:val="Normal"/>
         <w:widowControl/>
         <w:bidi w:val="0"/>
-        <w:spacing w:lineRule="auto" w:line="259" w:before="0" w:after="80"/>
+        <w:spacing w:lineRule="auto" w:line="252" w:before="0" w:after="60"/>
         <w:jc w:val="left"/>
         <w:rPr/>
       </w:pPr>
@@ -546,7 +670,7 @@
           <w:b w:val="false"/>
           <w:i w:val="false"/>
         </w:rPr>
-        <w:t>This is an emerging proposition, not a final answer. It provides the foundation to be tested, challenged and refined through the remaining sessions.</w:t>
+        <w:t>An emerging proposition, now carrying two days of evidence, to be tested against the sessions still to come.</w:t>
       </w:r>
     </w:p>
     <w:sectPr>
@@ -558,7 +682,7 @@
       <w:footerReference w:type="first" r:id="rId8"/>
       <w:type w:val="nextPage"/>
       <w:pgSz w:w="11906" w:h="16838"/>
-      <w:pgMar w:left="1247" w:right="1247" w:gutter="0" w:header="510" w:top="1077" w:footer="510" w:bottom="1077"/>
+      <w:pgMar w:left="1247" w:right="1247" w:gutter="0" w:header="510" w:top="964" w:footer="510" w:bottom="850"/>
       <w:pgNumType w:fmt="decimal"/>
       <w:formProt w:val="false"/>
       <w:textDirection w:val="lrTb"/>
@@ -620,7 +744,7 @@
       </w:rPr>
       <w:t>Individual Training – Key Takeaways</w:t>
       <w:tab/>
-      <w:t>Day 1 of 2</w:t>
+      <w:t>Working synthesis</w:t>
       <w:tab/>
       <w:t xml:space="preserve">Page </w:t>
     </w:r>
@@ -744,7 +868,7 @@
       </w:rPr>
       <w:t>Individual Training – Key Takeaways</w:t>
       <w:tab/>
-      <w:t>Day 1 of 2</w:t>
+      <w:t>Working synthesis</w:t>
       <w:tab/>
       <w:t xml:space="preserve">Page </w:t>
     </w:r>
@@ -1051,14 +1175,14 @@
     <w:pPr>
       <w:widowControl/>
       <w:bidi w:val="0"/>
-      <w:spacing w:lineRule="auto" w:line="259" w:before="0" w:after="80"/>
+      <w:spacing w:lineRule="auto" w:line="252" w:before="0" w:after="60"/>
       <w:jc w:val="left"/>
     </w:pPr>
     <w:rPr>
       <w:rFonts w:ascii="Calibri" w:hAnsi="Calibri" w:cs="Calibri" w:eastAsia="WenQuanYi Zen Hei"/>
       <w:color w:val="000000"/>
       <w:kern w:val="0"/>
-      <w:sz w:val="20"/>
+      <w:sz w:val="18"/>
       <w:szCs w:val="22"/>
       <w:lang w:val="en-US" w:eastAsia="en-US" w:bidi="ar-SA"/>
     </w:rPr>
@@ -1073,7 +1197,7 @@
     <w:pPr>
       <w:keepNext w:val="true"/>
       <w:keepLines/>
-      <w:spacing w:before="200" w:after="100"/>
+      <w:spacing w:before="160" w:after="80"/>
       <w:outlineLvl w:val="0"/>
     </w:pPr>
     <w:rPr>

</xml_diff>

<commit_message>
Integrate digital and distributed learning evidence into the takeaways synthesis
Add the continuous learning cycle alongside the progression, fold the digital,
simulation, learning-data and technology points into the existing takeaways,
and set the takeaways in two columns to hold the synthesis to one page.
</commit_message>
<xml_diff>
--- a/output/individual-training-key-takeaways.docx
+++ b/output/individual-training-key-takeaways.docx
@@ -5,14 +5,14 @@
     <w:p>
       <w:pPr>
         <w:pStyle w:val="Normal"/>
-        <w:spacing w:before="0" w:after="160"/>
+        <w:spacing w:before="0" w:after="120"/>
         <w:rPr/>
       </w:pPr>
       <w:r>
         <w:rPr/>
         <w:drawing>
           <wp:inline distT="0" distB="0" distL="0" distR="0">
-            <wp:extent cx="1259840" cy="287655"/>
+            <wp:extent cx="1151890" cy="262890"/>
             <wp:effectExtent l="0" t="0" r="0" b="0"/>
             <wp:docPr id="1" name="Picture 1" descr=""/>
             <wp:cNvGraphicFramePr>
@@ -36,7 +36,7 @@
                   <pic:spPr bwMode="auto">
                     <a:xfrm>
                       <a:off x="0" y="0"/>
-                      <a:ext cx="1259840" cy="287655"/>
+                      <a:ext cx="1151890" cy="262890"/>
                     </a:xfrm>
                     <a:prstGeom prst="rect">
                       <a:avLst/>
@@ -60,7 +60,7 @@
           <w:rFonts w:cs="Arial Black" w:ascii="Arial Black" w:hAnsi="Arial Black"/>
           <w:b w:val="false"/>
           <w:color w:val="000000"/>
-          <w:sz w:val="32"/>
+          <w:sz w:val="30"/>
         </w:rPr>
         <w:t>Individual Training – Key Takeaways</w:t>
       </w:r>
@@ -81,7 +81,7 @@
           <w:color w:val="00261B"/>
           <w:sz w:val="22"/>
         </w:rPr>
-        <w:t>Adult Learning Principles in Defence Training — Days 1–2</w:t>
+        <w:t>Adult Learning Principles in Defence Training — Sessions 1–3</w:t>
       </w:r>
     </w:p>
     <w:p>
@@ -90,7 +90,7 @@
         <w:pBdr>
           <w:bottom w:val="single" w:sz="6" w:space="6" w:color="B3A650"/>
         </w:pBdr>
-        <w:spacing w:before="100" w:after="120"/>
+        <w:spacing w:before="80" w:after="80"/>
         <w:rPr/>
       </w:pPr>
       <w:r>
@@ -154,7 +154,7 @@
           <w:color w:val="000000"/>
           <w:sz w:val="18"/>
         </w:rPr>
-        <w:t>Working draft v0.2</w:t>
+        <w:t>Working draft v0.3</w:t>
       </w:r>
     </w:p>
     <w:p>
@@ -183,7 +183,7 @@
           <w:left w:val="single" w:sz="28" w:space="8" w:color="D31145"/>
         </w:pBdr>
         <w:shd w:val="clear" w:color="auto" w:fill="DFD8AD"/>
-        <w:spacing w:before="80" w:after="120"/>
+        <w:spacing w:before="60" w:after="80"/>
         <w:ind w:left="283" w:right="283"/>
         <w:rPr/>
       </w:pPr>
@@ -193,7 +193,7 @@
           <w:b/>
           <w:i w:val="false"/>
           <w:color w:val="00261B"/>
-          <w:sz w:val="19"/>
+          <w:sz w:val="18"/>
         </w:rPr>
         <w:t>What is the Army approach to individual training?</w:t>
       </w:r>
@@ -231,302 +231,373 @@
         <w:t>Emerging Takeaways</w:t>
       </w:r>
     </w:p>
-    <w:p>
-      <w:pPr>
-        <w:pStyle w:val="Normal"/>
-        <w:tabs>
-          <w:tab w:val="clear" w:pos="720"/>
-          <w:tab w:val="left" w:pos="425" w:leader="none"/>
-        </w:tabs>
-        <w:spacing w:before="0" w:after="80"/>
-        <w:ind w:hanging="425" w:left="425"/>
-        <w:rPr/>
-      </w:pPr>
-      <w:r>
-        <w:rPr>
-          <w:rFonts w:cs="Arial Black" w:ascii="Arial Black" w:hAnsi="Arial Black"/>
-          <w:color w:val="D31145"/>
-          <w:sz w:val="18"/>
-        </w:rPr>
-        <w:t>1</w:t>
-        <w:tab/>
-      </w:r>
-      <w:r>
-        <w:rPr>
-          <w:rFonts w:cs="Calibri"/>
-          <w:b/>
-          <w:i w:val="false"/>
-        </w:rPr>
-        <w:t>Individual training exists to produce operational competence and effect.</w:t>
-      </w:r>
-      <w:r>
-        <w:rPr>
-          <w:rFonts w:cs="Calibri"/>
-          <w:b w:val="false"/>
-          <w:i w:val="false"/>
-        </w:rPr>
-        <w:t xml:space="preserve"> Course completion and education are means, not ends. Success is whether the individual can perform to standard in their role and on operations.</w:t>
-      </w:r>
-    </w:p>
-    <w:p>
-      <w:pPr>
-        <w:pStyle w:val="Normal"/>
-        <w:tabs>
-          <w:tab w:val="clear" w:pos="720"/>
-          <w:tab w:val="left" w:pos="425" w:leader="none"/>
-        </w:tabs>
-        <w:spacing w:before="0" w:after="80"/>
-        <w:ind w:hanging="425" w:left="425"/>
-        <w:rPr/>
-      </w:pPr>
-      <w:r>
-        <w:rPr>
-          <w:rFonts w:cs="Arial Black" w:ascii="Arial Black" w:hAnsi="Arial Black"/>
-          <w:color w:val="D31145"/>
-          <w:sz w:val="18"/>
-        </w:rPr>
-        <w:t>2</w:t>
-        <w:tab/>
-      </w:r>
-      <w:r>
-        <w:rPr>
-          <w:rFonts w:cs="Calibri"/>
-          <w:b/>
-          <w:i w:val="false"/>
-        </w:rPr>
-        <w:t>A common standard does not require an identical learning journey.</w:t>
-      </w:r>
-      <w:r>
-        <w:rPr>
-          <w:rFonts w:cs="Calibri"/>
-          <w:b w:val="false"/>
-          <w:i w:val="false"/>
-        </w:rPr>
-        <w:t xml:space="preserve"> People arrive shaped by genetics, prior experience, education, environment and stress, and neurodiversity adds further variation. Army can hold the performance standard firm while varying the route people take to reach it.</w:t>
-      </w:r>
-    </w:p>
-    <w:p>
-      <w:pPr>
-        <w:pStyle w:val="Normal"/>
-        <w:tabs>
-          <w:tab w:val="clear" w:pos="720"/>
-          <w:tab w:val="left" w:pos="425" w:leader="none"/>
-        </w:tabs>
-        <w:spacing w:before="0" w:after="80"/>
-        <w:ind w:hanging="425" w:left="425"/>
-        <w:rPr/>
-      </w:pPr>
-      <w:r>
-        <w:rPr>
-          <w:rFonts w:cs="Arial Black" w:ascii="Arial Black" w:hAnsi="Arial Black"/>
-          <w:color w:val="D31145"/>
-          <w:sz w:val="18"/>
-        </w:rPr>
-        <w:t>3</w:t>
-        <w:tab/>
-      </w:r>
-      <w:r>
-        <w:rPr>
-          <w:rFonts w:cs="Calibri"/>
-          <w:b/>
-          <w:i w:val="false"/>
-        </w:rPr>
-        <w:t>Capability is built, not simply selected for.</w:t>
-      </w:r>
-      <w:r>
-        <w:rPr>
-          <w:rFonts w:cs="Calibri"/>
-          <w:b w:val="false"/>
-          <w:i w:val="false"/>
-        </w:rPr>
-        <w:t xml:space="preserve"> The brain stays adaptable, so practice, repetition, feedback and experience keep developing performance well beyond initial training. Where operational risk permits, learners need room to fail safely and try again before facing consequential conditions.</w:t>
-      </w:r>
-    </w:p>
-    <w:p>
-      <w:pPr>
-        <w:pStyle w:val="Normal"/>
-        <w:tabs>
-          <w:tab w:val="clear" w:pos="720"/>
-          <w:tab w:val="left" w:pos="425" w:leader="none"/>
-        </w:tabs>
-        <w:spacing w:before="0" w:after="80"/>
-        <w:ind w:hanging="425" w:left="425"/>
-        <w:rPr/>
-      </w:pPr>
-      <w:r>
-        <w:rPr>
-          <w:rFonts w:cs="Arial Black" w:ascii="Arial Black" w:hAnsi="Arial Black"/>
-          <w:color w:val="D31145"/>
-          <w:sz w:val="18"/>
-        </w:rPr>
-        <w:t>4</w:t>
-        <w:tab/>
-      </w:r>
-      <w:r>
-        <w:rPr>
-          <w:rFonts w:cs="Calibri"/>
-          <w:b/>
-          <w:i w:val="false"/>
-        </w:rPr>
-        <w:t>Sequence training to the limits of working memory.</w:t>
-      </w:r>
-      <w:r>
-        <w:rPr>
-          <w:rFonts w:cs="Calibri"/>
-          <w:b w:val="false"/>
-          <w:i w:val="false"/>
-        </w:rPr>
-        <w:t xml:space="preserve"> Establish foundations, chunk complexity, then use retrieval and spaced practice to drive skills toward automaticity. Automaticity is what frees capacity for judgement under pressure.</w:t>
-      </w:r>
-    </w:p>
-    <w:p>
-      <w:pPr>
-        <w:pStyle w:val="Normal"/>
-        <w:tabs>
-          <w:tab w:val="clear" w:pos="720"/>
-          <w:tab w:val="left" w:pos="425" w:leader="none"/>
-        </w:tabs>
-        <w:spacing w:before="0" w:after="80"/>
-        <w:ind w:hanging="425" w:left="425"/>
-        <w:rPr/>
-      </w:pPr>
-      <w:r>
-        <w:rPr>
-          <w:rFonts w:cs="Arial Black" w:ascii="Arial Black" w:hAnsi="Arial Black"/>
-          <w:color w:val="D31145"/>
-          <w:sz w:val="18"/>
-        </w:rPr>
-        <w:t>5</w:t>
-        <w:tab/>
-      </w:r>
-      <w:r>
-        <w:rPr>
-          <w:rFonts w:cs="Calibri"/>
-          <w:b/>
-          <w:i w:val="false"/>
-        </w:rPr>
-        <w:t>Stress is a training variable to be managed, not removed.</w:t>
-      </w:r>
-      <w:r>
-        <w:rPr>
-          <w:rFonts w:cs="Calibri"/>
-          <w:b w:val="false"/>
-          <w:i w:val="false"/>
-        </w:rPr>
-        <w:t xml:space="preserve"> Too little challenge disengages; too much blocks learning. Complexity and pressure should increase deliberately as competence grows, so the learner finishes able to perform under operational conditions.</w:t>
-      </w:r>
-    </w:p>
-    <w:p>
-      <w:pPr>
-        <w:pStyle w:val="Normal"/>
-        <w:tabs>
-          <w:tab w:val="clear" w:pos="720"/>
-          <w:tab w:val="left" w:pos="425" w:leader="none"/>
-        </w:tabs>
-        <w:spacing w:before="0" w:after="80"/>
-        <w:ind w:hanging="425" w:left="425"/>
-        <w:rPr/>
-      </w:pPr>
-      <w:r>
-        <w:rPr>
-          <w:rFonts w:cs="Arial Black" w:ascii="Arial Black" w:hAnsi="Arial Black"/>
-          <w:color w:val="D31145"/>
-          <w:sz w:val="18"/>
-        </w:rPr>
-        <w:t>6</w:t>
-        <w:tab/>
-      </w:r>
-      <w:r>
-        <w:rPr>
-          <w:rFonts w:cs="Calibri"/>
-          <w:b/>
-          <w:i w:val="false"/>
-        </w:rPr>
-        <w:t>Learner state governs how much learning is possible.</w:t>
-      </w:r>
-      <w:r>
-        <w:rPr>
-          <w:rFonts w:cs="Calibri"/>
-          <w:b w:val="false"/>
-          <w:i w:val="false"/>
-        </w:rPr>
-        <w:t xml:space="preserve"> Sleep, fatigue, nutrition, emotional state, distraction and psychological safety materially affect capacity to learn. So does purpose — people commit when they can see why the training matters to their role.</w:t>
-      </w:r>
-    </w:p>
-    <w:p>
-      <w:pPr>
-        <w:pStyle w:val="Normal"/>
-        <w:tabs>
-          <w:tab w:val="clear" w:pos="720"/>
-          <w:tab w:val="left" w:pos="425" w:leader="none"/>
-        </w:tabs>
-        <w:spacing w:before="0" w:after="80"/>
-        <w:ind w:hanging="425" w:left="425"/>
-        <w:rPr/>
-      </w:pPr>
-      <w:r>
-        <w:rPr>
-          <w:rFonts w:cs="Arial Black" w:ascii="Arial Black" w:hAnsi="Arial Black"/>
-          <w:color w:val="D31145"/>
-          <w:sz w:val="18"/>
-        </w:rPr>
-        <w:t>7</w:t>
-        <w:tab/>
-      </w:r>
-      <w:r>
-        <w:rPr>
-          <w:rFonts w:cs="Calibri"/>
-          <w:b/>
-          <w:i w:val="false"/>
-        </w:rPr>
-        <w:t>The instructor is the adaptive element in the system.</w:t>
-      </w:r>
-      <w:r>
-        <w:rPr>
-          <w:rFonts w:cs="Calibri"/>
-          <w:b w:val="false"/>
-          <w:i w:val="false"/>
-        </w:rPr>
-        <w:t xml:space="preserve"> Instructors must read learner state, check understanding, give feedback, adjust pacing and know when specialist support is needed. Multiple modes of instruction, assistive technology and reasonable adjustment improve access without lowering the standard.</w:t>
-      </w:r>
-    </w:p>
-    <w:p>
-      <w:pPr>
-        <w:pStyle w:val="Normal"/>
-        <w:tabs>
-          <w:tab w:val="clear" w:pos="720"/>
-          <w:tab w:val="left" w:pos="425" w:leader="none"/>
-        </w:tabs>
-        <w:spacing w:before="0" w:after="80"/>
-        <w:ind w:hanging="425" w:left="425"/>
-        <w:rPr/>
-      </w:pPr>
-      <w:r>
-        <w:rPr>
-          <w:rFonts w:cs="Arial Black" w:ascii="Arial Black" w:hAnsi="Arial Black"/>
-          <w:color w:val="D31145"/>
-          <w:sz w:val="18"/>
-        </w:rPr>
-        <w:t>8</w:t>
-        <w:tab/>
-      </w:r>
-      <w:r>
-        <w:rPr>
-          <w:rFonts w:cs="Calibri"/>
-          <w:b/>
-          <w:i w:val="false"/>
-        </w:rPr>
-        <w:t>The science is evidence, not the approach.</w:t>
-      </w:r>
-      <w:r>
-        <w:rPr>
-          <w:rFonts w:cs="Calibri"/>
-          <w:b w:val="false"/>
-          <w:i w:val="false"/>
-        </w:rPr>
-        <w:t xml:space="preserve"> Neuroplasticity, cognitive load, neurodiversity and Universal Design for Learning — like ADDIE, SAM, 70:20:10 and Bloom's — inform how Army designs and delivers training; none is the approach itself. The binding constraint remains training governance and the speed at which Army can adapt training.</w:t>
-      </w:r>
-    </w:p>
+    <w:tbl>
+      <w:tblPr>
+        <w:tblW w:w="9412" w:type="dxa"/>
+        <w:jc w:val="left"/>
+        <w:tblInd w:w="-108" w:type="dxa"/>
+        <w:tblLayout w:type="fixed"/>
+        <w:tblCellMar>
+          <w:top w:w="0" w:type="dxa"/>
+          <w:left w:w="0" w:type="dxa"/>
+          <w:bottom w:w="0" w:type="dxa"/>
+          <w:right w:w="170" w:type="dxa"/>
+        </w:tblCellMar>
+        <w:tblLook w:val="04a0" w:noHBand="0" w:noVBand="1" w:firstColumn="1" w:lastRow="0" w:lastColumn="0" w:firstRow="1"/>
+      </w:tblPr>
+      <w:tblGrid>
+        <w:gridCol w:w="4706"/>
+        <w:gridCol w:w="4705"/>
+      </w:tblGrid>
+      <w:tr>
+        <w:trPr/>
+        <w:tc>
+          <w:tcPr>
+            <w:tcW w:w="4706" w:type="dxa"/>
+            <w:tcBorders/>
+          </w:tcPr>
+          <w:p>
+            <w:pPr>
+              <w:pStyle w:val="Normal"/>
+              <w:tabs>
+                <w:tab w:val="clear" w:pos="720"/>
+                <w:tab w:val="left" w:pos="425" w:leader="none"/>
+              </w:tabs>
+              <w:spacing w:before="0" w:after="60"/>
+              <w:ind w:hanging="425" w:left="425"/>
+              <w:rPr/>
+            </w:pPr>
+            <w:r>
+              <w:rPr>
+                <w:rFonts w:cs="Arial Black" w:ascii="Arial Black" w:hAnsi="Arial Black"/>
+                <w:color w:val="D31145"/>
+                <w:sz w:val="17"/>
+              </w:rPr>
+              <w:t>1</w:t>
+              <w:tab/>
+            </w:r>
+            <w:r>
+              <w:rPr>
+                <w:rFonts w:cs="Calibri"/>
+                <w:b/>
+                <w:i w:val="false"/>
+              </w:rPr>
+              <w:t>Individual training exists to produce operational competence and effect.</w:t>
+            </w:r>
+            <w:r>
+              <w:rPr>
+                <w:rFonts w:cs="Calibri"/>
+                <w:b w:val="false"/>
+                <w:i w:val="false"/>
+              </w:rPr>
+              <w:t xml:space="preserve"> Course completion is a means, not an end; success is whether the individual can perform to standard in role and on operations. Digital literacy — systems, data and increasingly AI-enabled tools — is now part of that competence across the force, not only in specialist trades.</w:t>
+            </w:r>
+          </w:p>
+          <w:p>
+            <w:pPr>
+              <w:pStyle w:val="Normal"/>
+              <w:tabs>
+                <w:tab w:val="clear" w:pos="720"/>
+                <w:tab w:val="left" w:pos="425" w:leader="none"/>
+              </w:tabs>
+              <w:spacing w:before="0" w:after="60"/>
+              <w:ind w:hanging="425" w:left="425"/>
+              <w:rPr/>
+            </w:pPr>
+            <w:r>
+              <w:rPr>
+                <w:rFonts w:cs="Arial Black" w:ascii="Arial Black" w:hAnsi="Arial Black"/>
+                <w:color w:val="D31145"/>
+                <w:sz w:val="17"/>
+              </w:rPr>
+              <w:t>2</w:t>
+              <w:tab/>
+            </w:r>
+            <w:r>
+              <w:rPr>
+                <w:rFonts w:cs="Calibri"/>
+                <w:b/>
+                <w:i w:val="false"/>
+              </w:rPr>
+              <w:t>A common standard does not require an identical learning journey.</w:t>
+            </w:r>
+            <w:r>
+              <w:rPr>
+                <w:rFonts w:cs="Calibri"/>
+                <w:b w:val="false"/>
+                <w:i w:val="false"/>
+              </w:rPr>
+              <w:t xml:space="preserve"> People arrive shaped by genetics, prior experience, education, environment, stress and neurodiversity. Multiple modes of instruction, assistive technology, reasonable adjustment and distributed learning give more flexible routes to the same standard.</w:t>
+            </w:r>
+          </w:p>
+          <w:p>
+            <w:pPr>
+              <w:pStyle w:val="Normal"/>
+              <w:tabs>
+                <w:tab w:val="clear" w:pos="720"/>
+                <w:tab w:val="left" w:pos="425" w:leader="none"/>
+              </w:tabs>
+              <w:spacing w:before="0" w:after="60"/>
+              <w:ind w:hanging="425" w:left="425"/>
+              <w:rPr/>
+            </w:pPr>
+            <w:r>
+              <w:rPr>
+                <w:rFonts w:cs="Arial Black" w:ascii="Arial Black" w:hAnsi="Arial Black"/>
+                <w:color w:val="D31145"/>
+                <w:sz w:val="17"/>
+              </w:rPr>
+              <w:t>3</w:t>
+              <w:tab/>
+            </w:r>
+            <w:r>
+              <w:rPr>
+                <w:rFonts w:cs="Calibri"/>
+                <w:b/>
+                <w:i w:val="false"/>
+              </w:rPr>
+              <w:t>Capability is built through sequenced practice.</w:t>
+            </w:r>
+            <w:r>
+              <w:rPr>
+                <w:rFonts w:cs="Calibri"/>
+                <w:b w:val="false"/>
+                <w:i w:val="false"/>
+              </w:rPr>
+              <w:t xml:space="preserve"> The brain stays adaptable: practice, repetition, feedback and experience keep developing performance well beyond initial training. Sequence within working-memory limits and use spaced retrieval to drive skills toward automaticity — what frees capacity for judgement under pressure.</w:t>
+            </w:r>
+          </w:p>
+          <w:p>
+            <w:pPr>
+              <w:pStyle w:val="Normal"/>
+              <w:tabs>
+                <w:tab w:val="clear" w:pos="720"/>
+                <w:tab w:val="left" w:pos="425" w:leader="none"/>
+              </w:tabs>
+              <w:spacing w:before="0" w:after="60"/>
+              <w:ind w:hanging="425" w:left="425"/>
+              <w:rPr/>
+            </w:pPr>
+            <w:r>
+              <w:rPr>
+                <w:rFonts w:cs="Arial Black" w:ascii="Arial Black" w:hAnsi="Arial Black"/>
+                <w:color w:val="D31145"/>
+                <w:sz w:val="17"/>
+              </w:rPr>
+              <w:t>4</w:t>
+              <w:tab/>
+            </w:r>
+            <w:r>
+              <w:rPr>
+                <w:rFonts w:cs="Calibri"/>
+                <w:b/>
+                <w:i w:val="false"/>
+              </w:rPr>
+              <w:t>Stress is a training variable to be managed, not removed.</w:t>
+            </w:r>
+            <w:r>
+              <w:rPr>
+                <w:rFonts w:cs="Calibri"/>
+                <w:b w:val="false"/>
+                <w:i w:val="false"/>
+              </w:rPr>
+              <w:t xml:space="preserve"> Too little challenge disengages, too much blocks learning. Increase complexity and pressure as competence grows, so the learner finishes able to perform under operational conditions.</w:t>
+            </w:r>
+          </w:p>
+          <w:p>
+            <w:pPr>
+              <w:pStyle w:val="Normal"/>
+              <w:tabs>
+                <w:tab w:val="clear" w:pos="720"/>
+                <w:tab w:val="left" w:pos="425" w:leader="none"/>
+              </w:tabs>
+              <w:spacing w:before="0" w:after="60"/>
+              <w:ind w:hanging="425" w:left="425"/>
+              <w:rPr/>
+            </w:pPr>
+            <w:r>
+              <w:rPr>
+                <w:rFonts w:cs="Arial Black" w:ascii="Arial Black" w:hAnsi="Arial Black"/>
+                <w:color w:val="D31145"/>
+                <w:sz w:val="17"/>
+              </w:rPr>
+              <w:t>5</w:t>
+              <w:tab/>
+            </w:r>
+            <w:r>
+              <w:rPr>
+                <w:rFonts w:cs="Calibri"/>
+                <w:b/>
+                <w:i w:val="false"/>
+              </w:rPr>
+              <w:t>Learner state governs how much learning is possible.</w:t>
+            </w:r>
+            <w:r>
+              <w:rPr>
+                <w:rFonts w:cs="Calibri"/>
+                <w:b w:val="false"/>
+                <w:i w:val="false"/>
+              </w:rPr>
+              <w:t xml:space="preserve"> Sleep, fatigue, nutrition, emotional state, distraction and psychological safety all affect capacity to learn — as does purpose, since people commit when they can see why the training matters to their role.</w:t>
+            </w:r>
+          </w:p>
+        </w:tc>
+        <w:tc>
+          <w:tcPr>
+            <w:tcW w:w="4705" w:type="dxa"/>
+            <w:tcBorders/>
+          </w:tcPr>
+          <w:p>
+            <w:pPr>
+              <w:pStyle w:val="Normal"/>
+              <w:tabs>
+                <w:tab w:val="clear" w:pos="720"/>
+                <w:tab w:val="left" w:pos="425" w:leader="none"/>
+              </w:tabs>
+              <w:spacing w:before="0" w:after="60"/>
+              <w:ind w:hanging="425" w:left="425"/>
+              <w:rPr/>
+            </w:pPr>
+            <w:r>
+              <w:rPr>
+                <w:rFonts w:cs="Arial Black" w:ascii="Arial Black" w:hAnsi="Arial Black"/>
+                <w:color w:val="D31145"/>
+                <w:sz w:val="17"/>
+              </w:rPr>
+              <w:t>6</w:t>
+              <w:tab/>
+            </w:r>
+            <w:r>
+              <w:rPr>
+                <w:rFonts w:cs="Calibri"/>
+                <w:b/>
+                <w:i w:val="false"/>
+              </w:rPr>
+              <w:t>Use the most appropriate method for the required outcome — not technology for technology's sake.</w:t>
+            </w:r>
+            <w:r>
+              <w:rPr>
+                <w:rFonts w:cs="Calibri"/>
+                <w:b w:val="false"/>
+                <w:i w:val="false"/>
+              </w:rPr>
+              <w:t xml:space="preserve"> Digital learning complements face-to-face training but cannot replace the human interaction that builds teamwork, judgement and discipline; used well it prepares learners beforehand, reinforces afterwards and frees contact time. Simulation bridges theory and live performance: high-risk tasks practised safely and repeatedly, with room to fail, before real consequences.</w:t>
+            </w:r>
+          </w:p>
+          <w:p>
+            <w:pPr>
+              <w:pStyle w:val="Normal"/>
+              <w:tabs>
+                <w:tab w:val="clear" w:pos="720"/>
+                <w:tab w:val="left" w:pos="425" w:leader="none"/>
+              </w:tabs>
+              <w:spacing w:before="0" w:after="60"/>
+              <w:ind w:hanging="425" w:left="425"/>
+              <w:rPr/>
+            </w:pPr>
+            <w:r>
+              <w:rPr>
+                <w:rFonts w:cs="Arial Black" w:ascii="Arial Black" w:hAnsi="Arial Black"/>
+                <w:color w:val="D31145"/>
+                <w:sz w:val="17"/>
+              </w:rPr>
+              <w:t>7</w:t>
+              <w:tab/>
+            </w:r>
+            <w:r>
+              <w:rPr>
+                <w:rFonts w:cs="Calibri"/>
+                <w:b/>
+                <w:i w:val="false"/>
+              </w:rPr>
+              <w:t>The instructor is the adaptive element in the system.</w:t>
+            </w:r>
+            <w:r>
+              <w:rPr>
+                <w:rFonts w:cs="Calibri"/>
+                <w:b w:val="false"/>
+                <w:i w:val="false"/>
+              </w:rPr>
+              <w:t xml:space="preserve"> Instructors read learner state, check understanding, give feedback, adjust pacing and know when specialist support is needed. Where digital delivery handles foundational knowledge, instructor effort should shift to coaching, guided practice and judgement.</w:t>
+            </w:r>
+          </w:p>
+          <w:p>
+            <w:pPr>
+              <w:pStyle w:val="Normal"/>
+              <w:tabs>
+                <w:tab w:val="clear" w:pos="720"/>
+                <w:tab w:val="left" w:pos="425" w:leader="none"/>
+              </w:tabs>
+              <w:spacing w:before="0" w:after="60"/>
+              <w:ind w:hanging="425" w:left="425"/>
+              <w:rPr/>
+            </w:pPr>
+            <w:r>
+              <w:rPr>
+                <w:rFonts w:cs="Arial Black" w:ascii="Arial Black" w:hAnsi="Arial Black"/>
+                <w:color w:val="D31145"/>
+                <w:sz w:val="17"/>
+              </w:rPr>
+              <w:t>8</w:t>
+              <w:tab/>
+            </w:r>
+            <w:r>
+              <w:rPr>
+                <w:rFonts w:cs="Calibri"/>
+                <w:b/>
+                <w:i w:val="false"/>
+              </w:rPr>
+              <w:t>Better evidence of individual performance is now within reach.</w:t>
+            </w:r>
+            <w:r>
+              <w:rPr>
+                <w:rFonts w:cs="Calibri"/>
+                <w:b w:val="false"/>
+                <w:i w:val="false"/>
+              </w:rPr>
+              <w:t xml:space="preserve"> Digital platforms, simulation and electronic observation show strengths, gaps and remediation needs far more richly than course results — provided learning, simulation, assessment and allied systems share data securely. Analytics and AI improve visibility of readiness; they do not transfer the decision.</w:t>
+            </w:r>
+          </w:p>
+          <w:p>
+            <w:pPr>
+              <w:pStyle w:val="Normal"/>
+              <w:tabs>
+                <w:tab w:val="clear" w:pos="720"/>
+                <w:tab w:val="left" w:pos="425" w:leader="none"/>
+              </w:tabs>
+              <w:spacing w:before="0" w:after="60"/>
+              <w:ind w:hanging="425" w:left="425"/>
+              <w:rPr/>
+            </w:pPr>
+            <w:r>
+              <w:rPr>
+                <w:rFonts w:cs="Arial Black" w:ascii="Arial Black" w:hAnsi="Arial Black"/>
+                <w:color w:val="D31145"/>
+                <w:sz w:val="17"/>
+              </w:rPr>
+              <w:t>9</w:t>
+              <w:tab/>
+            </w:r>
+            <w:r>
+              <w:rPr>
+                <w:rFonts w:cs="Calibri"/>
+                <w:b/>
+                <w:i w:val="false"/>
+              </w:rPr>
+              <w:t>Technology and frameworks are enablers, not the approach.</w:t>
+            </w:r>
+            <w:r>
+              <w:rPr>
+                <w:rFonts w:cs="Calibri"/>
+                <w:b w:val="false"/>
+                <w:i w:val="false"/>
+              </w:rPr>
+              <w:t xml:space="preserve"> Neuroplasticity, cognitive load, UDL, ADDIE, 70:20:10, learning platforms, simulation and AI inform how Army designs and delivers training; none is the approach itself. The binding constraint is governance, infrastructure, instructor capability, technical support and sustained ownership — though short-form distributed content is the fastest way to push updated lessons, SOPs and TTPs across the force.</w:t>
+            </w:r>
+          </w:p>
+        </w:tc>
+      </w:tr>
+    </w:tbl>
     <w:p>
       <w:pPr>
         <w:pStyle w:val="Heading1"/>
@@ -543,14 +614,14 @@
           <w:color w:val="000000"/>
           <w:sz w:val="24"/>
         </w:rPr>
-        <w:t>The Emerging Continuum</w:t>
+        <w:t>The Emerging Model</w:t>
       </w:r>
     </w:p>
     <w:p>
       <w:pPr>
         <w:pStyle w:val="Normal"/>
         <w:shd w:val="clear" w:color="auto" w:fill="00261B"/>
-        <w:spacing w:before="100" w:after="120"/>
+        <w:spacing w:before="60" w:after="80"/>
         <w:ind w:left="57" w:right="57"/>
         <w:jc w:val="center"/>
         <w:rPr/>
@@ -577,14 +648,14 @@
           <w:b w:val="false"/>
           <w:i w:val="false"/>
         </w:rPr>
-        <w:t>Instructor direction decreases across the continuum while learner autonomy, complexity and pressure increase. How far and how fast an individual moves is set by:</w:t>
+        <w:t>Instructor direction decreases across this progression while learner autonomy, complexity and pressure increase: high-risk and foundational training sits at the left, standardised and directive; experienced learners and professional development sit further right. How far and how fast an individual moves is set by:</w:t>
       </w:r>
     </w:p>
     <w:p>
       <w:pPr>
         <w:pStyle w:val="Normal"/>
         <w:shd w:val="clear" w:color="auto" w:fill="00261B"/>
-        <w:spacing w:before="100" w:after="120"/>
+        <w:spacing w:before="60" w:after="80"/>
         <w:ind w:left="57" w:right="57"/>
         <w:jc w:val="center"/>
         <w:rPr/>
@@ -611,7 +682,41 @@
           <w:b w:val="false"/>
           <w:i w:val="false"/>
         </w:rPr>
-        <w:t>High-risk and foundational training sits at the left: standardised, directive, tightly controlled. Experienced learners, leadership and professional development sit further right, with greater autonomy, reflection and judgement. Much of the right-hand end happens in units, not schools — workplace experience, coaching, practice and reflection — and is part of the training system, not an adjunct to it.</w:t>
+        <w:t>Training is not confined to a course, classroom or school. The same progression runs as a continuous cycle across a career:</w:t>
+      </w:r>
+    </w:p>
+    <w:p>
+      <w:pPr>
+        <w:pStyle w:val="Normal"/>
+        <w:shd w:val="clear" w:color="auto" w:fill="00261B"/>
+        <w:spacing w:before="60" w:after="80"/>
+        <w:ind w:left="57" w:right="57"/>
+        <w:jc w:val="center"/>
+        <w:rPr/>
+      </w:pPr>
+      <w:r>
+        <w:rPr>
+          <w:rFonts w:cs="Calibri"/>
+          <w:b/>
+          <w:i w:val="false"/>
+          <w:color w:val="FFFFFF"/>
+          <w:sz w:val="17"/>
+        </w:rPr>
+        <w:t>Prepare → Learn → Practise → Apply → Perform → Feedback → Reinforce / Adapt</w:t>
+      </w:r>
+    </w:p>
+    <w:p>
+      <w:pPr>
+        <w:pStyle w:val="Normal"/>
+        <w:rPr/>
+      </w:pPr>
+      <w:r>
+        <w:rPr>
+          <w:rFonts w:cs="Calibri"/>
+          <w:b w:val="false"/>
+          <w:i w:val="false"/>
+        </w:rPr>
+        <w:t>Formal instruction, digital and distributed learning, simulation, coaching and workplace experience are complementary parts of one system, accessible before, during and after a course — making readiness continuous rather than course-bound.</w:t>
       </w:r>
     </w:p>
     <w:p>
@@ -640,7 +745,7 @@
           <w:left w:val="single" w:sz="28" w:space="8" w:color="D31145"/>
         </w:pBdr>
         <w:shd w:val="clear" w:color="auto" w:fill="DFD8AD"/>
-        <w:spacing w:before="80" w:after="120"/>
+        <w:spacing w:before="60" w:after="80"/>
         <w:ind w:left="283" w:right="283"/>
         <w:rPr/>
       </w:pPr>
@@ -650,9 +755,9 @@
           <w:b/>
           <w:i w:val="false"/>
           <w:color w:val="00261B"/>
-          <w:sz w:val="19"/>
-        </w:rPr>
-        <w:t>Army develops individuals progressively toward a common operational standard — from foundation, through guided and independent practice, to applied learning and performance under pressure — adapting the direction, support, complexity and pressure applied to the risk, complexity, learner competence and required operational outcome. The standard is common; the journey to it need not be identical.</w:t>
+          <w:sz w:val="18"/>
+        </w:rPr>
+        <w:t>Army develops individuals progressively and continuously toward operational competence — combining direction, practice, experience, coaching and learner agency, enabled by technology and informed by evidence — according to risk, complexity, learner competence and the required operational outcome. The standard is common; the journey to it need not be identical.</w:t>
       </w:r>
     </w:p>
     <w:p>
@@ -660,7 +765,7 @@
         <w:pStyle w:val="Normal"/>
         <w:widowControl/>
         <w:bidi w:val="0"/>
-        <w:spacing w:lineRule="auto" w:line="252" w:before="0" w:after="60"/>
+        <w:spacing w:lineRule="auto" w:line="240" w:before="0" w:after="60"/>
         <w:jc w:val="left"/>
         <w:rPr/>
       </w:pPr>
@@ -670,7 +775,7 @@
           <w:b w:val="false"/>
           <w:i w:val="false"/>
         </w:rPr>
-        <w:t>An emerging proposition, now carrying two days of evidence, to be tested against the sessions still to come.</w:t>
+        <w:t>An emerging proposition, carrying three sessions of evidence, to be tested against those still to come.</w:t>
       </w:r>
     </w:p>
     <w:sectPr>
@@ -682,7 +787,7 @@
       <w:footerReference w:type="first" r:id="rId8"/>
       <w:type w:val="nextPage"/>
       <w:pgSz w:w="11906" w:h="16838"/>
-      <w:pgMar w:left="1247" w:right="1247" w:gutter="0" w:header="510" w:top="964" w:footer="510" w:bottom="850"/>
+      <w:pgMar w:left="1247" w:right="1247" w:gutter="0" w:header="510" w:top="850" w:footer="510" w:bottom="680"/>
       <w:pgNumType w:fmt="decimal"/>
       <w:formProt w:val="false"/>
       <w:textDirection w:val="lrTb"/>
@@ -1175,14 +1280,14 @@
     <w:pPr>
       <w:widowControl/>
       <w:bidi w:val="0"/>
-      <w:spacing w:lineRule="auto" w:line="252" w:before="0" w:after="60"/>
+      <w:spacing w:lineRule="auto" w:line="240" w:before="0" w:after="60"/>
       <w:jc w:val="left"/>
     </w:pPr>
     <w:rPr>
       <w:rFonts w:ascii="Calibri" w:hAnsi="Calibri" w:cs="Calibri" w:eastAsia="WenQuanYi Zen Hei"/>
       <w:color w:val="000000"/>
       <w:kern w:val="0"/>
-      <w:sz w:val="18"/>
+      <w:sz w:val="17"/>
       <w:szCs w:val="22"/>
       <w:lang w:val="en-US" w:eastAsia="en-US" w:bidi="ar-SA"/>
     </w:rPr>
@@ -1197,7 +1302,7 @@
     <w:pPr>
       <w:keepNext w:val="true"/>
       <w:keepLines/>
-      <w:spacing w:before="160" w:after="80"/>
+      <w:spacing w:before="120" w:after="60"/>
       <w:outlineLvl w:val="0"/>
     </w:pPr>
     <w:rPr>

</xml_diff>

<commit_message>
Adopt the condensed six-takeaway revision of the takeaways synthesis
Return the takeaways to a single column at a readable size now the list is
shorter, keeping the two-column path behind a flag, and let the proposition
callout carry its closing distinction as a second line.
</commit_message>
<xml_diff>
--- a/output/individual-training-key-takeaways.docx
+++ b/output/individual-training-key-takeaways.docx
@@ -5,14 +5,14 @@
     <w:p>
       <w:pPr>
         <w:pStyle w:val="Normal"/>
-        <w:spacing w:before="0" w:after="120"/>
+        <w:spacing w:before="0" w:after="180"/>
         <w:rPr/>
       </w:pPr>
       <w:r>
         <w:rPr/>
         <w:drawing>
           <wp:inline distT="0" distB="0" distL="0" distR="0">
-            <wp:extent cx="1151890" cy="262890"/>
+            <wp:extent cx="1296035" cy="295910"/>
             <wp:effectExtent l="0" t="0" r="0" b="0"/>
             <wp:docPr id="1" name="Picture 1" descr=""/>
             <wp:cNvGraphicFramePr>
@@ -36,7 +36,7 @@
                   <pic:spPr bwMode="auto">
                     <a:xfrm>
                       <a:off x="0" y="0"/>
-                      <a:ext cx="1151890" cy="262890"/>
+                      <a:ext cx="1296035" cy="295910"/>
                     </a:xfrm>
                     <a:prstGeom prst="rect">
                       <a:avLst/>
@@ -60,7 +60,7 @@
           <w:rFonts w:cs="Arial Black" w:ascii="Arial Black" w:hAnsi="Arial Black"/>
           <w:b w:val="false"/>
           <w:color w:val="000000"/>
-          <w:sz w:val="30"/>
+          <w:sz w:val="33"/>
         </w:rPr>
         <w:t>Individual Training – Key Takeaways</w:t>
       </w:r>
@@ -154,7 +154,7 @@
           <w:color w:val="000000"/>
           <w:sz w:val="18"/>
         </w:rPr>
-        <w:t>Working draft v0.3</w:t>
+        <w:t>Working draft v0.4</w:t>
       </w:r>
     </w:p>
     <w:p>
@@ -209,7 +209,7 @@
           <w:b w:val="false"/>
           <w:i w:val="false"/>
         </w:rPr>
-        <w:t>A working synthesis of the evidence so far, not a record of the sessions — to be tested and refined as the activity continues.</w:t>
+        <w:t>A working synthesis of the evidence so far, to be tested and refined as the activity continues.</w:t>
       </w:r>
     </w:p>
     <w:p>
@@ -231,373 +231,228 @@
         <w:t>Emerging Takeaways</w:t>
       </w:r>
     </w:p>
-    <w:tbl>
-      <w:tblPr>
-        <w:tblW w:w="9412" w:type="dxa"/>
-        <w:jc w:val="left"/>
-        <w:tblInd w:w="-108" w:type="dxa"/>
-        <w:tblLayout w:type="fixed"/>
-        <w:tblCellMar>
-          <w:top w:w="0" w:type="dxa"/>
-          <w:left w:w="0" w:type="dxa"/>
-          <w:bottom w:w="0" w:type="dxa"/>
-          <w:right w:w="170" w:type="dxa"/>
-        </w:tblCellMar>
-        <w:tblLook w:val="04a0" w:noHBand="0" w:noVBand="1" w:firstColumn="1" w:lastRow="0" w:lastColumn="0" w:firstRow="1"/>
-      </w:tblPr>
-      <w:tblGrid>
-        <w:gridCol w:w="4706"/>
-        <w:gridCol w:w="4705"/>
-      </w:tblGrid>
-      <w:tr>
-        <w:trPr/>
-        <w:tc>
-          <w:tcPr>
-            <w:tcW w:w="4706" w:type="dxa"/>
-            <w:tcBorders/>
-          </w:tcPr>
-          <w:p>
-            <w:pPr>
-              <w:pStyle w:val="Normal"/>
-              <w:tabs>
-                <w:tab w:val="clear" w:pos="720"/>
-                <w:tab w:val="left" w:pos="425" w:leader="none"/>
-              </w:tabs>
-              <w:spacing w:before="0" w:after="60"/>
-              <w:ind w:hanging="425" w:left="425"/>
-              <w:rPr/>
-            </w:pPr>
-            <w:r>
-              <w:rPr>
-                <w:rFonts w:cs="Arial Black" w:ascii="Arial Black" w:hAnsi="Arial Black"/>
-                <w:color w:val="D31145"/>
-                <w:sz w:val="17"/>
-              </w:rPr>
-              <w:t>1</w:t>
-              <w:tab/>
-            </w:r>
-            <w:r>
-              <w:rPr>
-                <w:rFonts w:cs="Calibri"/>
-                <w:b/>
-                <w:i w:val="false"/>
-              </w:rPr>
-              <w:t>Individual training exists to produce operational competence and effect.</w:t>
-            </w:r>
-            <w:r>
-              <w:rPr>
-                <w:rFonts w:cs="Calibri"/>
-                <w:b w:val="false"/>
-                <w:i w:val="false"/>
-              </w:rPr>
-              <w:t xml:space="preserve"> Course completion is a means, not an end; success is whether the individual can perform to standard in role and on operations. Digital literacy — systems, data and increasingly AI-enabled tools — is now part of that competence across the force, not only in specialist trades.</w:t>
-            </w:r>
-          </w:p>
-          <w:p>
-            <w:pPr>
-              <w:pStyle w:val="Normal"/>
-              <w:tabs>
-                <w:tab w:val="clear" w:pos="720"/>
-                <w:tab w:val="left" w:pos="425" w:leader="none"/>
-              </w:tabs>
-              <w:spacing w:before="0" w:after="60"/>
-              <w:ind w:hanging="425" w:left="425"/>
-              <w:rPr/>
-            </w:pPr>
-            <w:r>
-              <w:rPr>
-                <w:rFonts w:cs="Arial Black" w:ascii="Arial Black" w:hAnsi="Arial Black"/>
-                <w:color w:val="D31145"/>
-                <w:sz w:val="17"/>
-              </w:rPr>
-              <w:t>2</w:t>
-              <w:tab/>
-            </w:r>
-            <w:r>
-              <w:rPr>
-                <w:rFonts w:cs="Calibri"/>
-                <w:b/>
-                <w:i w:val="false"/>
-              </w:rPr>
-              <w:t>A common standard does not require an identical learning journey.</w:t>
-            </w:r>
-            <w:r>
-              <w:rPr>
-                <w:rFonts w:cs="Calibri"/>
-                <w:b w:val="false"/>
-                <w:i w:val="false"/>
-              </w:rPr>
-              <w:t xml:space="preserve"> People arrive shaped by genetics, prior experience, education, environment, stress and neurodiversity. Multiple modes of instruction, assistive technology, reasonable adjustment and distributed learning give more flexible routes to the same standard.</w:t>
-            </w:r>
-          </w:p>
-          <w:p>
-            <w:pPr>
-              <w:pStyle w:val="Normal"/>
-              <w:tabs>
-                <w:tab w:val="clear" w:pos="720"/>
-                <w:tab w:val="left" w:pos="425" w:leader="none"/>
-              </w:tabs>
-              <w:spacing w:before="0" w:after="60"/>
-              <w:ind w:hanging="425" w:left="425"/>
-              <w:rPr/>
-            </w:pPr>
-            <w:r>
-              <w:rPr>
-                <w:rFonts w:cs="Arial Black" w:ascii="Arial Black" w:hAnsi="Arial Black"/>
-                <w:color w:val="D31145"/>
-                <w:sz w:val="17"/>
-              </w:rPr>
-              <w:t>3</w:t>
-              <w:tab/>
-            </w:r>
-            <w:r>
-              <w:rPr>
-                <w:rFonts w:cs="Calibri"/>
-                <w:b/>
-                <w:i w:val="false"/>
-              </w:rPr>
-              <w:t>Capability is built through sequenced practice.</w:t>
-            </w:r>
-            <w:r>
-              <w:rPr>
-                <w:rFonts w:cs="Calibri"/>
-                <w:b w:val="false"/>
-                <w:i w:val="false"/>
-              </w:rPr>
-              <w:t xml:space="preserve"> The brain stays adaptable: practice, repetition, feedback and experience keep developing performance well beyond initial training. Sequence within working-memory limits and use spaced retrieval to drive skills toward automaticity — what frees capacity for judgement under pressure.</w:t>
-            </w:r>
-          </w:p>
-          <w:p>
-            <w:pPr>
-              <w:pStyle w:val="Normal"/>
-              <w:tabs>
-                <w:tab w:val="clear" w:pos="720"/>
-                <w:tab w:val="left" w:pos="425" w:leader="none"/>
-              </w:tabs>
-              <w:spacing w:before="0" w:after="60"/>
-              <w:ind w:hanging="425" w:left="425"/>
-              <w:rPr/>
-            </w:pPr>
-            <w:r>
-              <w:rPr>
-                <w:rFonts w:cs="Arial Black" w:ascii="Arial Black" w:hAnsi="Arial Black"/>
-                <w:color w:val="D31145"/>
-                <w:sz w:val="17"/>
-              </w:rPr>
-              <w:t>4</w:t>
-              <w:tab/>
-            </w:r>
-            <w:r>
-              <w:rPr>
-                <w:rFonts w:cs="Calibri"/>
-                <w:b/>
-                <w:i w:val="false"/>
-              </w:rPr>
-              <w:t>Stress is a training variable to be managed, not removed.</w:t>
-            </w:r>
-            <w:r>
-              <w:rPr>
-                <w:rFonts w:cs="Calibri"/>
-                <w:b w:val="false"/>
-                <w:i w:val="false"/>
-              </w:rPr>
-              <w:t xml:space="preserve"> Too little challenge disengages, too much blocks learning. Increase complexity and pressure as competence grows, so the learner finishes able to perform under operational conditions.</w:t>
-            </w:r>
-          </w:p>
-          <w:p>
-            <w:pPr>
-              <w:pStyle w:val="Normal"/>
-              <w:tabs>
-                <w:tab w:val="clear" w:pos="720"/>
-                <w:tab w:val="left" w:pos="425" w:leader="none"/>
-              </w:tabs>
-              <w:spacing w:before="0" w:after="60"/>
-              <w:ind w:hanging="425" w:left="425"/>
-              <w:rPr/>
-            </w:pPr>
-            <w:r>
-              <w:rPr>
-                <w:rFonts w:cs="Arial Black" w:ascii="Arial Black" w:hAnsi="Arial Black"/>
-                <w:color w:val="D31145"/>
-                <w:sz w:val="17"/>
-              </w:rPr>
-              <w:t>5</w:t>
-              <w:tab/>
-            </w:r>
-            <w:r>
-              <w:rPr>
-                <w:rFonts w:cs="Calibri"/>
-                <w:b/>
-                <w:i w:val="false"/>
-              </w:rPr>
-              <w:t>Learner state governs how much learning is possible.</w:t>
-            </w:r>
-            <w:r>
-              <w:rPr>
-                <w:rFonts w:cs="Calibri"/>
-                <w:b w:val="false"/>
-                <w:i w:val="false"/>
-              </w:rPr>
-              <w:t xml:space="preserve"> Sleep, fatigue, nutrition, emotional state, distraction and psychological safety all affect capacity to learn — as does purpose, since people commit when they can see why the training matters to their role.</w:t>
-            </w:r>
-          </w:p>
-        </w:tc>
-        <w:tc>
-          <w:tcPr>
-            <w:tcW w:w="4705" w:type="dxa"/>
-            <w:tcBorders/>
-          </w:tcPr>
-          <w:p>
-            <w:pPr>
-              <w:pStyle w:val="Normal"/>
-              <w:tabs>
-                <w:tab w:val="clear" w:pos="720"/>
-                <w:tab w:val="left" w:pos="425" w:leader="none"/>
-              </w:tabs>
-              <w:spacing w:before="0" w:after="60"/>
-              <w:ind w:hanging="425" w:left="425"/>
-              <w:rPr/>
-            </w:pPr>
-            <w:r>
-              <w:rPr>
-                <w:rFonts w:cs="Arial Black" w:ascii="Arial Black" w:hAnsi="Arial Black"/>
-                <w:color w:val="D31145"/>
-                <w:sz w:val="17"/>
-              </w:rPr>
-              <w:t>6</w:t>
-              <w:tab/>
-            </w:r>
-            <w:r>
-              <w:rPr>
-                <w:rFonts w:cs="Calibri"/>
-                <w:b/>
-                <w:i w:val="false"/>
-              </w:rPr>
-              <w:t>Use the most appropriate method for the required outcome — not technology for technology's sake.</w:t>
-            </w:r>
-            <w:r>
-              <w:rPr>
-                <w:rFonts w:cs="Calibri"/>
-                <w:b w:val="false"/>
-                <w:i w:val="false"/>
-              </w:rPr>
-              <w:t xml:space="preserve"> Digital learning complements face-to-face training but cannot replace the human interaction that builds teamwork, judgement and discipline; used well it prepares learners beforehand, reinforces afterwards and frees contact time. Simulation bridges theory and live performance: high-risk tasks practised safely and repeatedly, with room to fail, before real consequences.</w:t>
-            </w:r>
-          </w:p>
-          <w:p>
-            <w:pPr>
-              <w:pStyle w:val="Normal"/>
-              <w:tabs>
-                <w:tab w:val="clear" w:pos="720"/>
-                <w:tab w:val="left" w:pos="425" w:leader="none"/>
-              </w:tabs>
-              <w:spacing w:before="0" w:after="60"/>
-              <w:ind w:hanging="425" w:left="425"/>
-              <w:rPr/>
-            </w:pPr>
-            <w:r>
-              <w:rPr>
-                <w:rFonts w:cs="Arial Black" w:ascii="Arial Black" w:hAnsi="Arial Black"/>
-                <w:color w:val="D31145"/>
-                <w:sz w:val="17"/>
-              </w:rPr>
-              <w:t>7</w:t>
-              <w:tab/>
-            </w:r>
-            <w:r>
-              <w:rPr>
-                <w:rFonts w:cs="Calibri"/>
-                <w:b/>
-                <w:i w:val="false"/>
-              </w:rPr>
-              <w:t>The instructor is the adaptive element in the system.</w:t>
-            </w:r>
-            <w:r>
-              <w:rPr>
-                <w:rFonts w:cs="Calibri"/>
-                <w:b w:val="false"/>
-                <w:i w:val="false"/>
-              </w:rPr>
-              <w:t xml:space="preserve"> Instructors read learner state, check understanding, give feedback, adjust pacing and know when specialist support is needed. Where digital delivery handles foundational knowledge, instructor effort should shift to coaching, guided practice and judgement.</w:t>
-            </w:r>
-          </w:p>
-          <w:p>
-            <w:pPr>
-              <w:pStyle w:val="Normal"/>
-              <w:tabs>
-                <w:tab w:val="clear" w:pos="720"/>
-                <w:tab w:val="left" w:pos="425" w:leader="none"/>
-              </w:tabs>
-              <w:spacing w:before="0" w:after="60"/>
-              <w:ind w:hanging="425" w:left="425"/>
-              <w:rPr/>
-            </w:pPr>
-            <w:r>
-              <w:rPr>
-                <w:rFonts w:cs="Arial Black" w:ascii="Arial Black" w:hAnsi="Arial Black"/>
-                <w:color w:val="D31145"/>
-                <w:sz w:val="17"/>
-              </w:rPr>
-              <w:t>8</w:t>
-              <w:tab/>
-            </w:r>
-            <w:r>
-              <w:rPr>
-                <w:rFonts w:cs="Calibri"/>
-                <w:b/>
-                <w:i w:val="false"/>
-              </w:rPr>
-              <w:t>Better evidence of individual performance is now within reach.</w:t>
-            </w:r>
-            <w:r>
-              <w:rPr>
-                <w:rFonts w:cs="Calibri"/>
-                <w:b w:val="false"/>
-                <w:i w:val="false"/>
-              </w:rPr>
-              <w:t xml:space="preserve"> Digital platforms, simulation and electronic observation show strengths, gaps and remediation needs far more richly than course results — provided learning, simulation, assessment and allied systems share data securely. Analytics and AI improve visibility of readiness; they do not transfer the decision.</w:t>
-            </w:r>
-          </w:p>
-          <w:p>
-            <w:pPr>
-              <w:pStyle w:val="Normal"/>
-              <w:tabs>
-                <w:tab w:val="clear" w:pos="720"/>
-                <w:tab w:val="left" w:pos="425" w:leader="none"/>
-              </w:tabs>
-              <w:spacing w:before="0" w:after="60"/>
-              <w:ind w:hanging="425" w:left="425"/>
-              <w:rPr/>
-            </w:pPr>
-            <w:r>
-              <w:rPr>
-                <w:rFonts w:cs="Arial Black" w:ascii="Arial Black" w:hAnsi="Arial Black"/>
-                <w:color w:val="D31145"/>
-                <w:sz w:val="17"/>
-              </w:rPr>
-              <w:t>9</w:t>
-              <w:tab/>
-            </w:r>
-            <w:r>
-              <w:rPr>
-                <w:rFonts w:cs="Calibri"/>
-                <w:b/>
-                <w:i w:val="false"/>
-              </w:rPr>
-              <w:t>Technology and frameworks are enablers, not the approach.</w:t>
-            </w:r>
-            <w:r>
-              <w:rPr>
-                <w:rFonts w:cs="Calibri"/>
-                <w:b w:val="false"/>
-                <w:i w:val="false"/>
-              </w:rPr>
-              <w:t xml:space="preserve"> Neuroplasticity, cognitive load, UDL, ADDIE, 70:20:10, learning platforms, simulation and AI inform how Army designs and delivers training; none is the approach itself. The binding constraint is governance, infrastructure, instructor capability, technical support and sustained ownership — though short-form distributed content is the fastest way to push updated lessons, SOPs and TTPs across the force.</w:t>
-            </w:r>
-          </w:p>
-        </w:tc>
-      </w:tr>
-    </w:tbl>
+    <w:p>
+      <w:pPr>
+        <w:pStyle w:val="Normal"/>
+        <w:tabs>
+          <w:tab w:val="clear" w:pos="720"/>
+          <w:tab w:val="left" w:pos="425" w:leader="none"/>
+        </w:tabs>
+        <w:spacing w:before="0" w:after="100"/>
+        <w:ind w:hanging="425" w:left="425"/>
+        <w:rPr/>
+      </w:pPr>
+      <w:r>
+        <w:rPr>
+          <w:rFonts w:cs="Arial Black" w:ascii="Arial Black" w:hAnsi="Arial Black"/>
+          <w:color w:val="D31145"/>
+          <w:sz w:val="19"/>
+        </w:rPr>
+        <w:t>1</w:t>
+        <w:tab/>
+      </w:r>
+      <w:r>
+        <w:rPr>
+          <w:rFonts w:cs="Calibri"/>
+          <w:b/>
+          <w:i w:val="false"/>
+        </w:rPr>
+        <w:t>Individual training exists to produce operational competence.</w:t>
+      </w:r>
+      <w:r>
+        <w:rPr>
+          <w:rFonts w:cs="Calibri"/>
+          <w:b w:val="false"/>
+          <w:i w:val="false"/>
+        </w:rPr>
+        <w:t xml:space="preserve"> Course completion is a means, not the end. Success is whether an individual can perform to the required standard, in role and under operational conditions.</w:t>
+      </w:r>
+    </w:p>
+    <w:p>
+      <w:pPr>
+        <w:pStyle w:val="Normal"/>
+        <w:tabs>
+          <w:tab w:val="clear" w:pos="720"/>
+          <w:tab w:val="left" w:pos="425" w:leader="none"/>
+        </w:tabs>
+        <w:spacing w:before="0" w:after="100"/>
+        <w:ind w:hanging="425" w:left="425"/>
+        <w:rPr/>
+      </w:pPr>
+      <w:r>
+        <w:rPr>
+          <w:rFonts w:cs="Arial Black" w:ascii="Arial Black" w:hAnsi="Arial Black"/>
+          <w:color w:val="D31145"/>
+          <w:sz w:val="19"/>
+        </w:rPr>
+        <w:t>2</w:t>
+        <w:tab/>
+      </w:r>
+      <w:r>
+        <w:rPr>
+          <w:rFonts w:cs="Calibri"/>
+          <w:b/>
+          <w:i w:val="false"/>
+        </w:rPr>
+        <w:t>The standard is common; the learning journey need not be identical.</w:t>
+      </w:r>
+      <w:r>
+        <w:rPr>
+          <w:rFonts w:cs="Calibri"/>
+          <w:b w:val="false"/>
+          <w:i w:val="false"/>
+        </w:rPr>
+        <w:t xml:space="preserve"> Individuals arrive with different experience, competence and learning needs. Army should provide appropriate routes to the same required standard while maintaining operational assurance.</w:t>
+      </w:r>
+    </w:p>
+    <w:p>
+      <w:pPr>
+        <w:pStyle w:val="Normal"/>
+        <w:tabs>
+          <w:tab w:val="clear" w:pos="720"/>
+          <w:tab w:val="left" w:pos="425" w:leader="none"/>
+        </w:tabs>
+        <w:spacing w:before="0" w:after="100"/>
+        <w:ind w:hanging="425" w:left="425"/>
+        <w:rPr/>
+      </w:pPr>
+      <w:r>
+        <w:rPr>
+          <w:rFonts w:cs="Arial Black" w:ascii="Arial Black" w:hAnsi="Arial Black"/>
+          <w:color w:val="D31145"/>
+          <w:sz w:val="19"/>
+        </w:rPr>
+        <w:t>3</w:t>
+        <w:tab/>
+      </w:r>
+      <w:r>
+        <w:rPr>
+          <w:rFonts w:cs="Calibri"/>
+          <w:b/>
+          <w:i w:val="false"/>
+        </w:rPr>
+        <w:t>Competence develops progressively through practice, experience and feedback.</w:t>
+      </w:r>
+      <w:r>
+        <w:rPr>
+          <w:rFonts w:cs="Calibri"/>
+          <w:b w:val="false"/>
+          <w:i w:val="false"/>
+        </w:rPr>
+        <w:t xml:space="preserve"> Training should move deliberately from foundation knowledge and guided practice toward independent application, judgement and performance under pressure.</w:t>
+      </w:r>
+    </w:p>
+    <w:p>
+      <w:pPr>
+        <w:pStyle w:val="Normal"/>
+        <w:tabs>
+          <w:tab w:val="clear" w:pos="720"/>
+          <w:tab w:val="left" w:pos="425" w:leader="none"/>
+        </w:tabs>
+        <w:spacing w:before="0" w:after="100"/>
+        <w:ind w:hanging="425" w:left="425"/>
+        <w:rPr/>
+      </w:pPr>
+      <w:r>
+        <w:rPr>
+          <w:rFonts w:cs="Arial Black" w:ascii="Arial Black" w:hAnsi="Arial Black"/>
+          <w:color w:val="D31145"/>
+          <w:sz w:val="19"/>
+        </w:rPr>
+        <w:t>4</w:t>
+        <w:tab/>
+      </w:r>
+      <w:r>
+        <w:rPr>
+          <w:rFonts w:cs="Calibri"/>
+          <w:b/>
+          <w:i w:val="false"/>
+        </w:rPr>
+        <w:t>The level of direction should change as competence grows.</w:t>
+      </w:r>
+      <w:r>
+        <w:rPr>
+          <w:rFonts w:cs="Calibri"/>
+          <w:b w:val="false"/>
+          <w:i w:val="false"/>
+        </w:rPr>
+        <w:t xml:space="preserve"> Foundational and high-risk training requires greater standardisation and instructor control. As competence develops, learner autonomy, complexity, experiential learning and reflection can increase.</w:t>
+      </w:r>
+    </w:p>
+    <w:p>
+      <w:pPr>
+        <w:pStyle w:val="Normal"/>
+        <w:tabs>
+          <w:tab w:val="clear" w:pos="720"/>
+          <w:tab w:val="left" w:pos="425" w:leader="none"/>
+        </w:tabs>
+        <w:spacing w:before="0" w:after="100"/>
+        <w:ind w:hanging="425" w:left="425"/>
+        <w:rPr/>
+      </w:pPr>
+      <w:r>
+        <w:rPr>
+          <w:rFonts w:cs="Arial Black" w:ascii="Arial Black" w:hAnsi="Arial Black"/>
+          <w:color w:val="D31145"/>
+          <w:sz w:val="19"/>
+        </w:rPr>
+        <w:t>5</w:t>
+        <w:tab/>
+      </w:r>
+      <w:r>
+        <w:rPr>
+          <w:rFonts w:cs="Calibri"/>
+          <w:b/>
+          <w:i w:val="false"/>
+        </w:rPr>
+        <w:t>Individual training extends beyond the course.</w:t>
+      </w:r>
+      <w:r>
+        <w:rPr>
+          <w:rFonts w:cs="Calibri"/>
+          <w:b w:val="false"/>
+          <w:i w:val="false"/>
+        </w:rPr>
+        <w:t xml:space="preserve"> Formal instruction, digital and distributed learning, simulation, coaching, workplace experience, feedback and reinforcement are complementary parts of one continuous system. Learning should be accessible before, during and after formal training.</w:t>
+      </w:r>
+    </w:p>
+    <w:p>
+      <w:pPr>
+        <w:pStyle w:val="Normal"/>
+        <w:tabs>
+          <w:tab w:val="clear" w:pos="720"/>
+          <w:tab w:val="left" w:pos="425" w:leader="none"/>
+        </w:tabs>
+        <w:spacing w:before="0" w:after="100"/>
+        <w:ind w:hanging="425" w:left="425"/>
+        <w:rPr/>
+      </w:pPr>
+      <w:r>
+        <w:rPr>
+          <w:rFonts w:cs="Arial Black" w:ascii="Arial Black" w:hAnsi="Arial Black"/>
+          <w:color w:val="D31145"/>
+          <w:sz w:val="19"/>
+        </w:rPr>
+        <w:t>6</w:t>
+        <w:tab/>
+      </w:r>
+      <w:r>
+        <w:rPr>
+          <w:rFonts w:cs="Calibri"/>
+          <w:b/>
+          <w:i w:val="false"/>
+        </w:rPr>
+        <w:t>The method is selected to achieve the outcome.</w:t>
+      </w:r>
+      <w:r>
+        <w:rPr>
+          <w:rFonts w:cs="Calibri"/>
+          <w:b w:val="false"/>
+          <w:i w:val="false"/>
+        </w:rPr>
+        <w:t xml:space="preserve"> Instructors, technology, learning frameworks, simulation, data and AI are enablers — not the Army approach itself. Their value is in improving practice, feedback, adaptation and evidence of performance while maintaining the required standard.</w:t>
+      </w:r>
+    </w:p>
     <w:p>
       <w:pPr>
         <w:pStyle w:val="Heading1"/>
@@ -614,14 +469,14 @@
           <w:color w:val="000000"/>
           <w:sz w:val="24"/>
         </w:rPr>
-        <w:t>The Emerging Model</w:t>
+        <w:t>Emerging Model</w:t>
       </w:r>
     </w:p>
     <w:p>
       <w:pPr>
         <w:pStyle w:val="Normal"/>
         <w:shd w:val="clear" w:color="auto" w:fill="00261B"/>
-        <w:spacing w:before="60" w:after="80"/>
+        <w:spacing w:before="80" w:after="100"/>
         <w:ind w:left="57" w:right="57"/>
         <w:jc w:val="center"/>
         <w:rPr/>
@@ -632,7 +487,7 @@
           <w:b/>
           <w:i w:val="false"/>
           <w:color w:val="FFFFFF"/>
-          <w:sz w:val="17"/>
+          <w:sz w:val="18"/>
         </w:rPr>
         <w:t>Foundation → Guided Practice → Independent Practice → Applied / Experiential Learning → Performance Under Pressure</w:t>
       </w:r>
@@ -648,14 +503,42 @@
           <w:b w:val="false"/>
           <w:i w:val="false"/>
         </w:rPr>
-        <w:t>Instructor direction decreases across this progression while learner autonomy, complexity and pressure increase: high-risk and foundational training sits at the left, standardised and directive; experienced learners and professional development sit further right. How far and how fast an individual moves is set by:</w:t>
+        <w:t>Across this progression:</w:t>
+      </w:r>
+    </w:p>
+    <w:p>
+      <w:pPr>
+        <w:pStyle w:val="Normal"/>
+        <w:rPr/>
+      </w:pPr>
+      <w:r>
+        <w:rPr>
+          <w:rFonts w:cs="Calibri"/>
+          <w:b w:val="false"/>
+          <w:i w:val="false"/>
+        </w:rPr>
+        <w:t>Instructor direction decreases while learner autonomy, complexity and pressure increase.</w:t>
+      </w:r>
+    </w:p>
+    <w:p>
+      <w:pPr>
+        <w:pStyle w:val="Normal"/>
+        <w:rPr/>
+      </w:pPr>
+      <w:r>
+        <w:rPr>
+          <w:rFonts w:cs="Calibri"/>
+          <w:b w:val="false"/>
+          <w:i w:val="false"/>
+        </w:rPr>
+        <w:t>How far and how fast an individual progresses is determined by:</w:t>
       </w:r>
     </w:p>
     <w:p>
       <w:pPr>
         <w:pStyle w:val="Normal"/>
         <w:shd w:val="clear" w:color="auto" w:fill="00261B"/>
-        <w:spacing w:before="60" w:after="80"/>
+        <w:spacing w:before="80" w:after="100"/>
         <w:ind w:left="57" w:right="57"/>
         <w:jc w:val="center"/>
         <w:rPr/>
@@ -666,30 +549,30 @@
           <w:b/>
           <w:i w:val="false"/>
           <w:color w:val="FFFFFF"/>
-          <w:sz w:val="17"/>
-        </w:rPr>
-        <w:t>Risk × Complexity × Learner Experience &amp; Competence × Required Operational Outcome</w:t>
-      </w:r>
-    </w:p>
-    <w:p>
-      <w:pPr>
-        <w:pStyle w:val="Normal"/>
-        <w:rPr/>
-      </w:pPr>
-      <w:r>
-        <w:rPr>
-          <w:rFonts w:cs="Calibri"/>
-          <w:b w:val="false"/>
-          <w:i w:val="false"/>
-        </w:rPr>
-        <w:t>Training is not confined to a course, classroom or school. The same progression runs as a continuous cycle across a career:</w:t>
+          <w:sz w:val="18"/>
+        </w:rPr>
+        <w:t>Risk × Complexity × Learner Competence × Required Operational Outcome</w:t>
+      </w:r>
+    </w:p>
+    <w:p>
+      <w:pPr>
+        <w:pStyle w:val="Normal"/>
+        <w:rPr/>
+      </w:pPr>
+      <w:r>
+        <w:rPr>
+          <w:rFonts w:cs="Calibri"/>
+          <w:b w:val="false"/>
+          <w:i w:val="false"/>
+        </w:rPr>
+        <w:t>Individual training continues across a career through a recurring cycle:</w:t>
       </w:r>
     </w:p>
     <w:p>
       <w:pPr>
         <w:pStyle w:val="Normal"/>
         <w:shd w:val="clear" w:color="auto" w:fill="00261B"/>
-        <w:spacing w:before="60" w:after="80"/>
+        <w:spacing w:before="80" w:after="100"/>
         <w:ind w:left="57" w:right="57"/>
         <w:jc w:val="center"/>
         <w:rPr/>
@@ -700,23 +583,9 @@
           <w:b/>
           <w:i w:val="false"/>
           <w:color w:val="FFFFFF"/>
-          <w:sz w:val="17"/>
+          <w:sz w:val="18"/>
         </w:rPr>
         <w:t>Prepare → Learn → Practise → Apply → Perform → Feedback → Reinforce / Adapt</w:t>
-      </w:r>
-    </w:p>
-    <w:p>
-      <w:pPr>
-        <w:pStyle w:val="Normal"/>
-        <w:rPr/>
-      </w:pPr>
-      <w:r>
-        <w:rPr>
-          <w:rFonts w:cs="Calibri"/>
-          <w:b w:val="false"/>
-          <w:i w:val="false"/>
-        </w:rPr>
-        <w:t>Formal instruction, digital and distributed learning, simulation, coaching and workplace experience are complementary parts of one system, accessible before, during and after a course — making readiness continuous rather than course-bound.</w:t>
       </w:r>
     </w:p>
     <w:p>
@@ -757,7 +626,24 @@
           <w:color w:val="00261B"/>
           <w:sz w:val="18"/>
         </w:rPr>
-        <w:t>Army develops individuals progressively and continuously toward operational competence — combining direction, practice, experience, coaching and learner agency, enabled by technology and informed by evidence — according to risk, complexity, learner competence and the required operational outcome. The standard is common; the journey to it need not be identical.</w:t>
+        <w:t>Army develops individuals progressively and continuously toward operational competence, combining direction, practice, experience, coaching and learner agency according to risk, complexity, learner competence and the required operational outcome.</w:t>
+      </w:r>
+      <w:r>
+        <w:rPr>
+          <w:rFonts w:cs="Calibri"/>
+          <w:sz w:val="18"/>
+        </w:rPr>
+        <w:br/>
+      </w:r>
+      <w:r>
+        <w:rPr>
+          <w:rFonts w:cs="Calibri"/>
+          <w:b/>
+          <w:i w:val="false"/>
+          <w:color w:val="00261B"/>
+          <w:sz w:val="18"/>
+        </w:rPr>
+        <w:t>The standard is common; the journey to it need not be identical.</w:t>
       </w:r>
     </w:p>
     <w:p>
@@ -765,7 +651,7 @@
         <w:pStyle w:val="Normal"/>
         <w:widowControl/>
         <w:bidi w:val="0"/>
-        <w:spacing w:lineRule="auto" w:line="240" w:before="0" w:after="60"/>
+        <w:spacing w:lineRule="auto" w:line="252" w:before="0" w:after="80"/>
         <w:jc w:val="left"/>
         <w:rPr/>
       </w:pPr>
@@ -775,7 +661,7 @@
           <w:b w:val="false"/>
           <w:i w:val="false"/>
         </w:rPr>
-        <w:t>An emerging proposition, carrying three sessions of evidence, to be tested against those still to come.</w:t>
+        <w:t>An emerging proposition based on the evidence from the first three sessions, to be tested against those still to come.</w:t>
       </w:r>
     </w:p>
     <w:sectPr>
@@ -787,7 +673,7 @@
       <w:footerReference w:type="first" r:id="rId8"/>
       <w:type w:val="nextPage"/>
       <w:pgSz w:w="11906" w:h="16838"/>
-      <w:pgMar w:left="1247" w:right="1247" w:gutter="0" w:header="510" w:top="850" w:footer="510" w:bottom="680"/>
+      <w:pgMar w:left="1247" w:right="1247" w:gutter="0" w:header="510" w:top="1020" w:footer="510" w:bottom="907"/>
       <w:pgNumType w:fmt="decimal"/>
       <w:formProt w:val="false"/>
       <w:textDirection w:val="lrTb"/>
@@ -1280,14 +1166,14 @@
     <w:pPr>
       <w:widowControl/>
       <w:bidi w:val="0"/>
-      <w:spacing w:lineRule="auto" w:line="240" w:before="0" w:after="60"/>
+      <w:spacing w:lineRule="auto" w:line="252" w:before="0" w:after="80"/>
       <w:jc w:val="left"/>
     </w:pPr>
     <w:rPr>
       <w:rFonts w:ascii="Calibri" w:hAnsi="Calibri" w:cs="Calibri" w:eastAsia="WenQuanYi Zen Hei"/>
       <w:color w:val="000000"/>
       <w:kern w:val="0"/>
-      <w:sz w:val="17"/>
+      <w:sz w:val="19"/>
       <w:szCs w:val="22"/>
       <w:lang w:val="en-US" w:eastAsia="en-US" w:bidi="ar-SA"/>
     </w:rPr>
@@ -1302,7 +1188,7 @@
     <w:pPr>
       <w:keepNext w:val="true"/>
       <w:keepLines/>
-      <w:spacing w:before="120" w:after="60"/>
+      <w:spacing w:before="200" w:after="100"/>
       <w:outlineLvl w:val="0"/>
     </w:pPr>
     <w:rPr>

</xml_diff>

<commit_message>
Integrate the agentic AI session into the takeaways synthesis
Add a takeaway that competent use of these tools is itself a training
requirement, and leave the model and proposition unchanged since the session
did not test them.

Co-Authored-By: Claude Opus 5 <noreply@anthropic.com>
Claude-Session: https://claude.ai/code/session_014ebTbQdLKZmAdeXWfR1Dsj
</commit_message>
<xml_diff>
--- a/output/individual-training-key-takeaways.docx
+++ b/output/individual-training-key-takeaways.docx
@@ -81,7 +81,7 @@
           <w:color w:val="00261B"/>
           <w:sz w:val="22"/>
         </w:rPr>
-        <w:t>Adult Learning Principles in Defence Training — Sessions 1–3</w:t>
+        <w:t>Adult Learning Principles in Defence Training — Sessions 1–4</w:t>
       </w:r>
     </w:p>
     <w:p>
@@ -154,7 +154,7 @@
           <w:color w:val="000000"/>
           <w:sz w:val="18"/>
         </w:rPr>
-        <w:t>Working draft v0.4</w:t>
+        <w:t>Working draft v0.5</w:t>
       </w:r>
     </w:p>
     <w:p>
@@ -455,6 +455,43 @@
     </w:p>
     <w:p>
       <w:pPr>
+        <w:pStyle w:val="Normal"/>
+        <w:tabs>
+          <w:tab w:val="clear" w:pos="720"/>
+          <w:tab w:val="left" w:pos="425" w:leader="none"/>
+        </w:tabs>
+        <w:spacing w:before="0" w:after="100"/>
+        <w:ind w:hanging="425" w:left="425"/>
+        <w:rPr/>
+      </w:pPr>
+      <w:r>
+        <w:rPr>
+          <w:rFonts w:cs="Arial Black" w:ascii="Arial Black" w:hAnsi="Arial Black"/>
+          <w:color w:val="D31145"/>
+          <w:sz w:val="19"/>
+        </w:rPr>
+        <w:t>7</w:t>
+        <w:tab/>
+      </w:r>
+      <w:r>
+        <w:rPr>
+          <w:rFonts w:cs="Calibri"/>
+          <w:b/>
+          <w:i w:val="false"/>
+        </w:rPr>
+        <w:t>Competent use of these tools is itself a training requirement.</w:t>
+      </w:r>
+      <w:r>
+        <w:rPr>
+          <w:rFonts w:cs="Calibri"/>
+          <w:b w:val="false"/>
+          <w:i w:val="false"/>
+        </w:rPr>
+        <w:t xml:space="preserve"> Investment in technology does not by itself produce capability; the gain comes from people who are practised in using it. Army should develop this like any other skill, through deliberate practice, time to experiment and tolerance for early failure.</w:t>
+      </w:r>
+    </w:p>
+    <w:p>
+      <w:pPr>
         <w:pStyle w:val="Heading1"/>
         <w:pBdr>
           <w:top w:val="single" w:sz="12" w:space="6" w:color="000000"/>
@@ -661,7 +698,7 @@
           <w:b w:val="false"/>
           <w:i w:val="false"/>
         </w:rPr>
-        <w:t>An emerging proposition based on the evidence from the first three sessions, to be tested against those still to come.</w:t>
+        <w:t>An emerging proposition based on the evidence from the first four sessions, to be tested against those still to come.</w:t>
       </w:r>
     </w:p>
     <w:sectPr>

</xml_diff>

<commit_message>
Remove em dashes from the takeaways one-pager
Co-Authored-By: Claude Opus 5 <noreply@anthropic.com>
Claude-Session: https://claude.ai/code/session_014ebTbQdLKZmAdeXWfR1Dsj
</commit_message>
<xml_diff>
--- a/output/individual-training-key-takeaways.docx
+++ b/output/individual-training-key-takeaways.docx
@@ -81,7 +81,7 @@
           <w:color w:val="00261B"/>
           <w:sz w:val="22"/>
         </w:rPr>
-        <w:t>Adult Learning Principles in Defence Training — Sessions 1–4</w:t>
+        <w:t>Adult Learning Principles in Defence Training, Sessions 1–4</w:t>
       </w:r>
     </w:p>
     <w:p>
@@ -450,7 +450,7 @@
           <w:b w:val="false"/>
           <w:i w:val="false"/>
         </w:rPr>
-        <w:t xml:space="preserve"> Instructors, technology, learning frameworks, simulation, data and AI are enablers — not the Army approach itself. Their value is in improving practice, feedback, adaptation and evidence of performance while maintaining the required standard.</w:t>
+        <w:t xml:space="preserve"> Instructors, technology, learning frameworks, simulation, data and AI are enablers, not the Army approach itself. Their value is in improving practice, feedback, adaptation and evidence of performance while maintaining the required standard.</w:t>
       </w:r>
     </w:p>
     <w:p>

</xml_diff>

<commit_message>
Fold the tool-competence point into takeaway 6 and tighten the proposition
Keeps the paper at six takeaways so the AI insight is not elevated into a
separate pillar, and lets the emerging model carry detail the proposition no
longer needs to state.

Co-Authored-By: Claude Opus 5 <noreply@anthropic.com>
Claude-Session: https://claude.ai/code/session_014ebTbQdLKZmAdeXWfR1Dsj
</commit_message>
<xml_diff>
--- a/output/individual-training-key-takeaways.docx
+++ b/output/individual-training-key-takeaways.docx
@@ -154,7 +154,7 @@
           <w:color w:val="000000"/>
           <w:sz w:val="18"/>
         </w:rPr>
-        <w:t>Working draft v0.5</w:t>
+        <w:t>Working draft v0.6</w:t>
       </w:r>
     </w:p>
     <w:p>
@@ -450,44 +450,7 @@
           <w:b w:val="false"/>
           <w:i w:val="false"/>
         </w:rPr>
-        <w:t xml:space="preserve"> Instructors, technology, learning frameworks, simulation, data and AI are enablers, not the Army approach itself. Their value is in improving practice, feedback, adaptation and evidence of performance while maintaining the required standard.</w:t>
-      </w:r>
-    </w:p>
-    <w:p>
-      <w:pPr>
-        <w:pStyle w:val="Normal"/>
-        <w:tabs>
-          <w:tab w:val="clear" w:pos="720"/>
-          <w:tab w:val="left" w:pos="425" w:leader="none"/>
-        </w:tabs>
-        <w:spacing w:before="0" w:after="100"/>
-        <w:ind w:hanging="425" w:left="425"/>
-        <w:rPr/>
-      </w:pPr>
-      <w:r>
-        <w:rPr>
-          <w:rFonts w:cs="Arial Black" w:ascii="Arial Black" w:hAnsi="Arial Black"/>
-          <w:color w:val="D31145"/>
-          <w:sz w:val="19"/>
-        </w:rPr>
-        <w:t>7</w:t>
-        <w:tab/>
-      </w:r>
-      <w:r>
-        <w:rPr>
-          <w:rFonts w:cs="Calibri"/>
-          <w:b/>
-          <w:i w:val="false"/>
-        </w:rPr>
-        <w:t>Competent use of these tools is itself a training requirement.</w:t>
-      </w:r>
-      <w:r>
-        <w:rPr>
-          <w:rFonts w:cs="Calibri"/>
-          <w:b w:val="false"/>
-          <w:i w:val="false"/>
-        </w:rPr>
-        <w:t xml:space="preserve"> Investment in technology does not by itself produce capability; the gain comes from people who are practised in using it. Army should develop this like any other skill, through deliberate practice, time to experiment and tolerance for early failure.</w:t>
+        <w:t xml:space="preserve"> Instructors, technology, learning frameworks, simulation, data and AI are enablers, not the Army approach itself. Their value depends on people being competent and practised in their use, and on improving practice, feedback, adaptation and evidence of performance.</w:t>
       </w:r>
     </w:p>
     <w:p>
@@ -663,7 +626,7 @@
           <w:color w:val="00261B"/>
           <w:sz w:val="18"/>
         </w:rPr>
-        <w:t>Army develops individuals progressively and continuously toward operational competence, combining direction, practice, experience, coaching and learner agency according to risk, complexity, learner competence and the required operational outcome.</w:t>
+        <w:t>Army develops individuals progressively and continuously toward operational competence, balancing direction, practice, experience and learner agency according to risk, complexity, competence and operational need.</w:t>
       </w:r>
       <w:r>
         <w:rPr>

</xml_diff>

<commit_message>
Sharpen takeaway 2 and rebalance the poster toward the approach
Takeaway 2 now states the Army-relevant point directly: adapt the pathway
without diluting the standard. On the poster, the career cycle gains a drawn
return path so feedback visibly re-enters at Learn, and the takeaways are set
as quieter supporting evidence beneath a dominant approach.

Co-Authored-By: Claude Opus 5 <noreply@anthropic.com>
Claude-Session: https://claude.ai/code/session_014ebTbQdLKZmAdeXWfR1Dsj
</commit_message>
<xml_diff>
--- a/output/individual-training-key-takeaways.docx
+++ b/output/individual-training-key-takeaways.docx
@@ -154,7 +154,7 @@
           <w:color w:val="000000"/>
           <w:sz w:val="18"/>
         </w:rPr>
-        <w:t>Working draft v0.6</w:t>
+        <w:t>Working draft v0.7</w:t>
       </w:r>
     </w:p>
     <w:p>
@@ -302,7 +302,7 @@
           <w:b w:val="false"/>
           <w:i w:val="false"/>
         </w:rPr>
-        <w:t xml:space="preserve"> Individuals arrive with different experience, competence and learning needs. Army should provide appropriate routes to the same required standard while maintaining operational assurance.</w:t>
+        <w:t xml:space="preserve"> Individuals arrive with different experience, competence and learning needs. Army adapts the pathway without diluting the standard, and retains operational assurance in doing so.</w:t>
       </w:r>
     </w:p>
     <w:p>

</xml_diff>

<commit_message>
Integrate the fifth session into the takeaways synthesis
Session five was largely confirmatory. It adds two clauses to takeaway 6: the
judgement to check what these tools produce, and that human interaction remains
essential and unsubstitutable. Rebuild all three products for sessions 1 to 5.

Co-Authored-By: Claude Opus 5 <noreply@anthropic.com>
Claude-Session: https://claude.ai/code/session_014ebTbQdLKZmAdeXWfR1Dsj
</commit_message>
<xml_diff>
--- a/output/individual-training-key-takeaways.docx
+++ b/output/individual-training-key-takeaways.docx
@@ -81,7 +81,7 @@
           <w:color w:val="00261B"/>
           <w:sz w:val="22"/>
         </w:rPr>
-        <w:t>Adult Learning Principles in Defence Training, Sessions 1–4</w:t>
+        <w:t>Adult Learning Principles in Defence Training, Sessions 1–5</w:t>
       </w:r>
     </w:p>
     <w:p>
@@ -154,7 +154,7 @@
           <w:color w:val="000000"/>
           <w:sz w:val="18"/>
         </w:rPr>
-        <w:t>Working draft v0.7</w:t>
+        <w:t>Working draft v0.8</w:t>
       </w:r>
     </w:p>
     <w:p>
@@ -450,7 +450,7 @@
           <w:b w:val="false"/>
           <w:i w:val="false"/>
         </w:rPr>
-        <w:t xml:space="preserve"> Instructors, technology, learning frameworks, simulation, data and AI are enablers, not the Army approach itself. Their value depends on people being competent and practised in their use, and on improving practice, feedback, adaptation and evidence of performance.</w:t>
+        <w:t xml:space="preserve"> Instructors, technology, learning frameworks, simulation, data and AI are enablers, not the Army approach itself. Their value depends on people being competent and practised in their use, on the judgement to check what they produce, and on improving practice, feedback, adaptation and evidence of performance. Human interaction remains essential to teamwork, judgement and trust, and no method replaces it.</w:t>
       </w:r>
     </w:p>
     <w:p>
@@ -661,7 +661,7 @@
           <w:b w:val="false"/>
           <w:i w:val="false"/>
         </w:rPr>
-        <w:t>An emerging proposition based on the evidence from the first four sessions, to be tested against those still to come.</w:t>
+        <w:t>An emerging proposition based on the evidence from the first five sessions, to be tested against those still to come.</w:t>
       </w:r>
     </w:p>
     <w:sectPr>

</xml_diff>